<commit_message>
Fill agreed finance terms into Panamera repayment contract
Seller is Fluffy Horde Pty Ltd; agreed price A$45,000 (down from the
A$46,800 asking price). Terms: 30% down payment (A$13,500, less the
A$500 holding deposit already paid), balance of A$31,500 over 24 monthly
installments at 12% p.a. on the reducing balance — 23 payments of
A$1,482.81 and a final A$1,482.92 (total interest A$4,087.55). New
clause 3.8 includes comprehensive insurance (premium benchmarked to RAC
pricing) and rego renewal in the price, with Sections 7.1-7.2 adjusted
to match. Schedule A now carries the full pre-computed amortization
table.

Co-Authored-By: Claude Fable 5 <noreply@anthropic.com>
Claude-Session: https://claude.ai/code/session_01VvhD1vGqwTgrN3Mmhhvja8
</commit_message>
<xml_diff>
--- a/contracts/vehicle-sale-repayment-contract-2012-porsche-panamera.docx
+++ b/contracts/vehicle-sale-repayment-contract-2012-porsche-panamera.docx
@@ -356,7 +356,7 @@
                 <w:sz w:val="21"/>
                 <w:szCs w:val="21"/>
               </w:rPr>
-              <w:t xml:space="preserve">Malachite Prestige (dealer 经销商)</w:t>
+              <w:t xml:space="preserve">Fluffy Horde Pty Ltd (seller 卖方)</w:t>
             </w:r>
           </w:p>
         </w:tc>
@@ -1624,7 +1624,7 @@
           <w:sz w:val="21"/>
           <w:szCs w:val="21"/>
         </w:rPr>
-        <w:t xml:space="preserve">The total purchase price of the Vehicle is A$46,800 (forty-six thousand eight hundred Australian dollars) (the "Purchase Price"), inclusive of the items listed in Section 2 unless stated otherwise.</w:t>
+        <w:t xml:space="preserve">The total purchase price of the Vehicle is A$45,000.00 (forty-five thousand Australian dollars) (the "Purchase Price"), inclusive of the items listed in Section 2 and the insurance and registration described in Section 3.8.</w:t>
       </w:r>
     </w:p>
     <w:p>
@@ -1638,7 +1638,7 @@
           <w:sz w:val="21"/>
           <w:szCs w:val="21"/>
         </w:rPr>
-        <w:t xml:space="preserve">本车辆总价款为46,800澳元(大写:肆万陆仟捌佰澳元整)(以下简称"总价款"),除另有说明外包含第2条所列配置。</w:t>
+        <w:t xml:space="preserve">本车辆总价款为45,000.00澳元(大写:肆万伍仟澳元整)(以下简称"总价款"),包含第2条所列配置及第3.8条所述保险与注册费。</w:t>
       </w:r>
     </w:p>
     <w:p>
@@ -1662,7 +1662,7 @@
           <w:sz w:val="21"/>
           <w:szCs w:val="21"/>
         </w:rPr>
-        <w:t xml:space="preserve">The Buyer shall pay a down payment of ________________ upon signing this Agreement, or on ______________ (date). Any holding deposit already paid to the Seller (including the A$500 online holding deposit) is credited toward the down payment.</w:t>
+        <w:t xml:space="preserve">The Buyer shall pay a down payment of A$13,500.00 (30% of the Purchase Price) upon signing this Agreement, or on ______________ (date). The A$500.00 online holding deposit already paid is credited toward the down payment, leaving A$13,000.00 payable.</w:t>
       </w:r>
     </w:p>
     <w:p>
@@ -1676,7 +1676,7 @@
           <w:sz w:val="21"/>
           <w:szCs w:val="21"/>
         </w:rPr>
-        <w:t xml:space="preserve">买方应于签署本协议时或于______年____月____日支付首付款________________。买方此前已向卖方支付的订金(包括通过网站支付的500澳元订金)抵扣首付款。</w:t>
+        <w:t xml:space="preserve">买方应于签署本协议时或于______年____月____日支付首付款13,500.00澳元(总价款的30%)。已通过网站支付的500.00澳元订金抵扣首付款,首付尚需支付13,000.00澳元。</w:t>
       </w:r>
     </w:p>
     <w:p>
@@ -1700,7 +1700,7 @@
           <w:sz w:val="21"/>
           <w:szCs w:val="21"/>
         </w:rPr>
-        <w:t xml:space="preserve">The remaining balance of ________________ shall be paid in ______ installments of ________________ each, due on the ______ day of each month, starting on ______________ and ending on ______________.</w:t>
+        <w:t xml:space="preserve">The remaining balance of A$31,500.00 shall be paid in 24 monthly installments over two (2) years: 23 installments of A$1,482.81 each and a final installment of A$1,482.92, due on the ______ day of each month, starting on ______________ and ending on ______________. The installments total A$35,587.55, including total interest of A$4,087.55 (amortization schedule in Schedule A).</w:t>
       </w:r>
     </w:p>
     <w:p>
@@ -1714,7 +1714,7 @@
           <w:sz w:val="21"/>
           <w:szCs w:val="21"/>
         </w:rPr>
-        <w:t xml:space="preserve">剩余款项________________由买方分______期支付,每期________________,于每月______日到期,自______年____月____日起至______年____月____日止付清。</w:t>
+        <w:t xml:space="preserve">剩余款项31,500.00澳元由买方分24期(2年)按月支付:前23期每期1,482.81澳元,末期1,482.92澳元,于每月______日到期,自______年____月____日起至______年____月____日止。分期款项合计35,587.55澳元,其中利息合计4,087.55澳元(摊还明细见附表A)。</w:t>
       </w:r>
     </w:p>
     <w:p>
@@ -1738,7 +1738,7 @@
           <w:sz w:val="21"/>
           <w:szCs w:val="21"/>
         </w:rPr>
-        <w:t xml:space="preserve">The unpaid balance shall bear interest at ______% per annum / shall be interest-free (select one). If no rate is filled in, the balance is interest-free.</w:t>
+        <w:t xml:space="preserve">The unpaid balance bears interest at 12% per annum (1% per month), calculated on the reducing balance and already included in the installments set out in Section 3.3 and Schedule A. If the Buyer prepays, interest is recalculated on the actual reducing balance.</w:t>
       </w:r>
     </w:p>
     <w:p>
@@ -1752,7 +1752,7 @@
           <w:sz w:val="21"/>
           <w:szCs w:val="21"/>
         </w:rPr>
-        <w:t xml:space="preserve">未付余额按年利率______%计息/不计息(二选一)。如未填写利率,视为不计息。</w:t>
+        <w:t xml:space="preserve">未付余额按年利率12%(月利率1%)计息,按余额递减方式计算,利息已包含在第3.3条及附表A所列分期款项中。如买方提前还款,利息按实际剩余余额重新计算。</w:t>
       </w:r>
     </w:p>
     <w:p>
@@ -1867,6 +1867,44 @@
           <w:szCs w:val="21"/>
         </w:rPr>
         <w:t xml:space="preserve">买方可随时提前偿还全部或部分未付余款,无需支付任何违约金;如有利息,应相应重新计算。</w:t>
+      </w:r>
+    </w:p>
+    <w:p>
+      <w:pPr>
+        <w:spacing w:after="40"/>
+        <w:jc w:val="both"/>
+      </w:pPr>
+      <w:r>
+        <w:rPr>
+          <w:rFonts w:ascii="Times New Roman" w:eastAsia="SimSun" w:hAnsi="Times New Roman"/>
+          <w:b/>
+          <w:bCs/>
+          <w:sz w:val="21"/>
+          <w:szCs w:val="21"/>
+        </w:rPr>
+        <w:t xml:space="preserve">3.8 Insurance and registration included 包含保险与注册费. </w:t>
+      </w:r>
+      <w:r>
+        <w:rPr>
+          <w:rFonts w:ascii="Times New Roman" w:eastAsia="SimSun" w:hAnsi="Times New Roman"/>
+          <w:sz w:val="21"/>
+          <w:szCs w:val="21"/>
+        </w:rPr>
+        <w:t xml:space="preserve">The Purchase Price includes, for the repayment period set out in Section 3.3: (a) comprehensive insurance for the Vehicle, with the premium benchmarked against RAC’s quoted price for comparable cover (or an RAC policy); and (b) vehicle registration (rego) renewal, including CTP. The Seller shall arrange or bear these costs, and the policy and registration documents shall record the parties’ interests where applicable.</w:t>
+      </w:r>
+    </w:p>
+    <w:p>
+      <w:pPr>
+        <w:spacing w:after="180"/>
+        <w:jc w:val="both"/>
+      </w:pPr>
+      <w:r>
+        <w:rPr>
+          <w:rFonts w:ascii="Times New Roman" w:eastAsia="SimSun" w:hAnsi="Times New Roman"/>
+          <w:sz w:val="21"/>
+          <w:szCs w:val="21"/>
+        </w:rPr>
+        <w:t xml:space="preserve">总价款包含第3.3条所述还款期间内的:(a)本车辆商业全险,保费参考RAC同等保障的报价(或直接投保RAC保单);(b)车辆注册费(rego,含强制三者险CTP)的续费。上述费用由卖方负责办理或承担;如适用,保单及注册文件应载明双方权益。</w:t>
       </w:r>
     </w:p>
     <w:p>
@@ -2334,7 +2372,7 @@
           <w:sz w:val="21"/>
           <w:szCs w:val="21"/>
         </w:rPr>
-        <w:t xml:space="preserve">From the date of delivery, the Buyer is responsible for insurance, registration, taxes, inspections, fuel, maintenance, parking, tolls, fines and all other costs of keeping and using the Vehicle.</w:t>
+        <w:t xml:space="preserve">From the date of delivery, the Buyer is responsible for taxes, inspections, fuel, maintenance, parking, tolls, fines and all other costs of keeping and using the Vehicle, except the comprehensive insurance and registration (rego) included in the Purchase Price under Section 3.8.</w:t>
       </w:r>
     </w:p>
     <w:p>
@@ -2348,7 +2386,7 @@
           <w:sz w:val="21"/>
           <w:szCs w:val="21"/>
         </w:rPr>
-        <w:t xml:space="preserve">自交付之日起,本车辆的保险、登记、税费、年检、燃油、保养维修、停车、通行费、罚款及其他持有和使用费用均由买方承担。</w:t>
+        <w:t xml:space="preserve">自交付之日起,除第3.8条已包含在总价款中的商业全险及注册费(rego)外,本车辆的税费、检验、燃油、保养维修、停车、通行费、罚款及其他持有和使用费用均由买方承担。</w:t>
       </w:r>
     </w:p>
     <w:p>
@@ -2372,7 +2410,7 @@
           <w:sz w:val="21"/>
           <w:szCs w:val="21"/>
         </w:rPr>
-        <w:t xml:space="preserve">Until the Purchase Price is paid in full, the Buyer shall keep the Vehicle continuously insured (at least compulsory third-party (CTP) insurance; comprehensive insurance: ☐ required ☐ recommended) and shall provide proof of insurance to the Seller upon request.</w:t>
+        <w:t xml:space="preserve">Until the Purchase Price is paid in full, the Vehicle shall remain continuously covered by the comprehensive insurance provided under Section 3.8, and each party shall provide proof of insurance and registration to the other upon request.</w:t>
       </w:r>
     </w:p>
     <w:p>
@@ -2386,7 +2424,7 @@
           <w:sz w:val="21"/>
           <w:szCs w:val="21"/>
         </w:rPr>
-        <w:t xml:space="preserve">在总价款付清前,买方应为本车辆持续投保(至少包括强制第三方责任险CTP;商业全险:☐必须投保 ☐建议投保),并应卖方要求提供保险凭证。</w:t>
+        <w:t xml:space="preserve">在总价款付清前,本车辆应持续处于第3.8条所含商业全险的保障之下;任一方应另一方要求,提供保险及注册凭证。</w:t>
       </w:r>
     </w:p>
     <w:p>
@@ -3008,6 +3046,19 @@
     </w:p>
     <w:p>
       <w:pPr>
+        <w:spacing w:after="60"/>
+      </w:pPr>
+      <w:r>
+        <w:rPr>
+          <w:rFonts w:ascii="Times New Roman" w:eastAsia="SimSun" w:hAnsi="Times New Roman"/>
+          <w:sz w:val="21"/>
+          <w:szCs w:val="21"/>
+        </w:rPr>
+        <w:t xml:space="preserve">Vehicle 车辆:2012 Porsche Panamera (VIN WP0ZZZ97ZCL020838)    Purchase Price 总价款:A$45,000.00</w:t>
+      </w:r>
+    </w:p>
+    <w:p>
+      <w:pPr>
         <w:spacing w:after="160"/>
       </w:pPr>
       <w:r>
@@ -3016,7 +3067,7 @@
           <w:sz w:val="21"/>
           <w:szCs w:val="21"/>
         </w:rPr>
-        <w:t xml:space="preserve">Vehicle 车辆:2012 Porsche Panamera (VIN WP0ZZZ97ZCL020838)    Purchase Price 总价款:A$46,800</w:t>
+        <w:t xml:space="preserve">Financed balance 分期本金:A$31,500.00 · 24 monthly installments 期 · 12% p.a. 年利率(reducing balance 余额递减)</w:t>
       </w:r>
     </w:p>
     <w:tbl>
@@ -3319,7 +3370,7 @@
                 <w:sz w:val="21"/>
                 <w:szCs w:val="21"/>
               </w:rPr>
-              <w:t xml:space="preserve">A$500</w:t>
+              <w:t xml:space="preserve">A$500.00</w:t>
             </w:r>
           </w:p>
         </w:tc>
@@ -3390,17 +3441,17 @@
           </w:tcPr>
           <w:p>
             <w:pPr>
-              <w:jc w:val="left"/>
-            </w:pPr>
-            <w:r>
-              <w:rPr>
-                <w:rFonts w:ascii="Times New Roman" w:eastAsia="SimSun" w:hAnsi="Times New Roman"/>
-                <w:b w:val="false"/>
-                <w:bCs w:val="false"/>
-                <w:sz w:val="21"/>
-                <w:szCs w:val="21"/>
-              </w:rPr>
-              <w:t xml:space="preserve"/>
+              <w:jc w:val="center"/>
+            </w:pPr>
+            <w:r>
+              <w:rPr>
+                <w:rFonts w:ascii="Times New Roman" w:eastAsia="SimSun" w:hAnsi="Times New Roman"/>
+                <w:b w:val="false"/>
+                <w:bCs w:val="false"/>
+                <w:sz w:val="21"/>
+                <w:szCs w:val="21"/>
+              </w:rPr>
+              <w:t xml:space="preserve">A$44,500.00</w:t>
             </w:r>
           </w:p>
         </w:tc>
@@ -3500,17 +3551,17 @@
           </w:tcPr>
           <w:p>
             <w:pPr>
-              <w:jc w:val="left"/>
-            </w:pPr>
-            <w:r>
-              <w:rPr>
-                <w:rFonts w:ascii="Times New Roman" w:eastAsia="SimSun" w:hAnsi="Times New Roman"/>
-                <w:b w:val="false"/>
-                <w:bCs w:val="false"/>
-                <w:sz w:val="21"/>
-                <w:szCs w:val="21"/>
-              </w:rPr>
-              <w:t xml:space="preserve"/>
+              <w:jc w:val="center"/>
+            </w:pPr>
+            <w:r>
+              <w:rPr>
+                <w:rFonts w:ascii="Times New Roman" w:eastAsia="SimSun" w:hAnsi="Times New Roman"/>
+                <w:b w:val="false"/>
+                <w:bCs w:val="false"/>
+                <w:sz w:val="21"/>
+                <w:szCs w:val="21"/>
+              </w:rPr>
+              <w:t xml:space="preserve">A$13,000.00</w:t>
             </w:r>
           </w:p>
         </w:tc>
@@ -3581,17 +3632,17 @@
           </w:tcPr>
           <w:p>
             <w:pPr>
-              <w:jc w:val="left"/>
-            </w:pPr>
-            <w:r>
-              <w:rPr>
-                <w:rFonts w:ascii="Times New Roman" w:eastAsia="SimSun" w:hAnsi="Times New Roman"/>
-                <w:b w:val="false"/>
-                <w:bCs w:val="false"/>
-                <w:sz w:val="21"/>
-                <w:szCs w:val="21"/>
-              </w:rPr>
-              <w:t xml:space="preserve"/>
+              <w:jc w:val="center"/>
+            </w:pPr>
+            <w:r>
+              <w:rPr>
+                <w:rFonts w:ascii="Times New Roman" w:eastAsia="SimSun" w:hAnsi="Times New Roman"/>
+                <w:b w:val="false"/>
+                <w:bCs w:val="false"/>
+                <w:sz w:val="21"/>
+                <w:szCs w:val="21"/>
+              </w:rPr>
+              <w:t xml:space="preserve">A$31,500.00</w:t>
             </w:r>
           </w:p>
         </w:tc>
@@ -3691,17 +3742,17 @@
           </w:tcPr>
           <w:p>
             <w:pPr>
-              <w:jc w:val="left"/>
-            </w:pPr>
-            <w:r>
-              <w:rPr>
-                <w:rFonts w:ascii="Times New Roman" w:eastAsia="SimSun" w:hAnsi="Times New Roman"/>
-                <w:b w:val="false"/>
-                <w:bCs w:val="false"/>
-                <w:sz w:val="21"/>
-                <w:szCs w:val="21"/>
-              </w:rPr>
-              <w:t xml:space="preserve"/>
+              <w:jc w:val="center"/>
+            </w:pPr>
+            <w:r>
+              <w:rPr>
+                <w:rFonts w:ascii="Times New Roman" w:eastAsia="SimSun" w:hAnsi="Times New Roman"/>
+                <w:b w:val="false"/>
+                <w:bCs w:val="false"/>
+                <w:sz w:val="21"/>
+                <w:szCs w:val="21"/>
+              </w:rPr>
+              <w:t xml:space="preserve">A$1,482.81</w:t>
             </w:r>
           </w:p>
         </w:tc>
@@ -3772,17 +3823,17 @@
           </w:tcPr>
           <w:p>
             <w:pPr>
-              <w:jc w:val="left"/>
-            </w:pPr>
-            <w:r>
-              <w:rPr>
-                <w:rFonts w:ascii="Times New Roman" w:eastAsia="SimSun" w:hAnsi="Times New Roman"/>
-                <w:b w:val="false"/>
-                <w:bCs w:val="false"/>
-                <w:sz w:val="21"/>
-                <w:szCs w:val="21"/>
-              </w:rPr>
-              <w:t xml:space="preserve"/>
+              <w:jc w:val="center"/>
+            </w:pPr>
+            <w:r>
+              <w:rPr>
+                <w:rFonts w:ascii="Times New Roman" w:eastAsia="SimSun" w:hAnsi="Times New Roman"/>
+                <w:b w:val="false"/>
+                <w:bCs w:val="false"/>
+                <w:sz w:val="21"/>
+                <w:szCs w:val="21"/>
+              </w:rPr>
+              <w:t xml:space="preserve">A$30,332.19</w:t>
             </w:r>
           </w:p>
         </w:tc>
@@ -3882,17 +3933,17 @@
           </w:tcPr>
           <w:p>
             <w:pPr>
-              <w:jc w:val="left"/>
-            </w:pPr>
-            <w:r>
-              <w:rPr>
-                <w:rFonts w:ascii="Times New Roman" w:eastAsia="SimSun" w:hAnsi="Times New Roman"/>
-                <w:b w:val="false"/>
-                <w:bCs w:val="false"/>
-                <w:sz w:val="21"/>
-                <w:szCs w:val="21"/>
-              </w:rPr>
-              <w:t xml:space="preserve"/>
+              <w:jc w:val="center"/>
+            </w:pPr>
+            <w:r>
+              <w:rPr>
+                <w:rFonts w:ascii="Times New Roman" w:eastAsia="SimSun" w:hAnsi="Times New Roman"/>
+                <w:b w:val="false"/>
+                <w:bCs w:val="false"/>
+                <w:sz w:val="21"/>
+                <w:szCs w:val="21"/>
+              </w:rPr>
+              <w:t xml:space="preserve">A$1,482.81</w:t>
             </w:r>
           </w:p>
         </w:tc>
@@ -3963,17 +4014,17 @@
           </w:tcPr>
           <w:p>
             <w:pPr>
-              <w:jc w:val="left"/>
-            </w:pPr>
-            <w:r>
-              <w:rPr>
-                <w:rFonts w:ascii="Times New Roman" w:eastAsia="SimSun" w:hAnsi="Times New Roman"/>
-                <w:b w:val="false"/>
-                <w:bCs w:val="false"/>
-                <w:sz w:val="21"/>
-                <w:szCs w:val="21"/>
-              </w:rPr>
-              <w:t xml:space="preserve"/>
+              <w:jc w:val="center"/>
+            </w:pPr>
+            <w:r>
+              <w:rPr>
+                <w:rFonts w:ascii="Times New Roman" w:eastAsia="SimSun" w:hAnsi="Times New Roman"/>
+                <w:b w:val="false"/>
+                <w:bCs w:val="false"/>
+                <w:sz w:val="21"/>
+                <w:szCs w:val="21"/>
+              </w:rPr>
+              <w:t xml:space="preserve">A$29,152.70</w:t>
             </w:r>
           </w:p>
         </w:tc>
@@ -4073,17 +4124,17 @@
           </w:tcPr>
           <w:p>
             <w:pPr>
-              <w:jc w:val="left"/>
-            </w:pPr>
-            <w:r>
-              <w:rPr>
-                <w:rFonts w:ascii="Times New Roman" w:eastAsia="SimSun" w:hAnsi="Times New Roman"/>
-                <w:b w:val="false"/>
-                <w:bCs w:val="false"/>
-                <w:sz w:val="21"/>
-                <w:szCs w:val="21"/>
-              </w:rPr>
-              <w:t xml:space="preserve"/>
+              <w:jc w:val="center"/>
+            </w:pPr>
+            <w:r>
+              <w:rPr>
+                <w:rFonts w:ascii="Times New Roman" w:eastAsia="SimSun" w:hAnsi="Times New Roman"/>
+                <w:b w:val="false"/>
+                <w:bCs w:val="false"/>
+                <w:sz w:val="21"/>
+                <w:szCs w:val="21"/>
+              </w:rPr>
+              <w:t xml:space="preserve">A$1,482.81</w:t>
             </w:r>
           </w:p>
         </w:tc>
@@ -4154,17 +4205,17 @@
           </w:tcPr>
           <w:p>
             <w:pPr>
-              <w:jc w:val="left"/>
-            </w:pPr>
-            <w:r>
-              <w:rPr>
-                <w:rFonts w:ascii="Times New Roman" w:eastAsia="SimSun" w:hAnsi="Times New Roman"/>
-                <w:b w:val="false"/>
-                <w:bCs w:val="false"/>
-                <w:sz w:val="21"/>
-                <w:szCs w:val="21"/>
-              </w:rPr>
-              <w:t xml:space="preserve"/>
+              <w:jc w:val="center"/>
+            </w:pPr>
+            <w:r>
+              <w:rPr>
+                <w:rFonts w:ascii="Times New Roman" w:eastAsia="SimSun" w:hAnsi="Times New Roman"/>
+                <w:b w:val="false"/>
+                <w:bCs w:val="false"/>
+                <w:sz w:val="21"/>
+                <w:szCs w:val="21"/>
+              </w:rPr>
+              <w:t xml:space="preserve">A$27,961.42</w:t>
             </w:r>
           </w:p>
         </w:tc>
@@ -4264,17 +4315,17 @@
           </w:tcPr>
           <w:p>
             <w:pPr>
-              <w:jc w:val="left"/>
-            </w:pPr>
-            <w:r>
-              <w:rPr>
-                <w:rFonts w:ascii="Times New Roman" w:eastAsia="SimSun" w:hAnsi="Times New Roman"/>
-                <w:b w:val="false"/>
-                <w:bCs w:val="false"/>
-                <w:sz w:val="21"/>
-                <w:szCs w:val="21"/>
-              </w:rPr>
-              <w:t xml:space="preserve"/>
+              <w:jc w:val="center"/>
+            </w:pPr>
+            <w:r>
+              <w:rPr>
+                <w:rFonts w:ascii="Times New Roman" w:eastAsia="SimSun" w:hAnsi="Times New Roman"/>
+                <w:b w:val="false"/>
+                <w:bCs w:val="false"/>
+                <w:sz w:val="21"/>
+                <w:szCs w:val="21"/>
+              </w:rPr>
+              <w:t xml:space="preserve">A$1,482.81</w:t>
             </w:r>
           </w:p>
         </w:tc>
@@ -4345,17 +4396,17 @@
           </w:tcPr>
           <w:p>
             <w:pPr>
-              <w:jc w:val="left"/>
-            </w:pPr>
-            <w:r>
-              <w:rPr>
-                <w:rFonts w:ascii="Times New Roman" w:eastAsia="SimSun" w:hAnsi="Times New Roman"/>
-                <w:b w:val="false"/>
-                <w:bCs w:val="false"/>
-                <w:sz w:val="21"/>
-                <w:szCs w:val="21"/>
-              </w:rPr>
-              <w:t xml:space="preserve"/>
+              <w:jc w:val="center"/>
+            </w:pPr>
+            <w:r>
+              <w:rPr>
+                <w:rFonts w:ascii="Times New Roman" w:eastAsia="SimSun" w:hAnsi="Times New Roman"/>
+                <w:b w:val="false"/>
+                <w:bCs w:val="false"/>
+                <w:sz w:val="21"/>
+                <w:szCs w:val="21"/>
+              </w:rPr>
+              <w:t xml:space="preserve">A$26,758.22</w:t>
             </w:r>
           </w:p>
         </w:tc>
@@ -4455,17 +4506,17 @@
           </w:tcPr>
           <w:p>
             <w:pPr>
-              <w:jc w:val="left"/>
-            </w:pPr>
-            <w:r>
-              <w:rPr>
-                <w:rFonts w:ascii="Times New Roman" w:eastAsia="SimSun" w:hAnsi="Times New Roman"/>
-                <w:b w:val="false"/>
-                <w:bCs w:val="false"/>
-                <w:sz w:val="21"/>
-                <w:szCs w:val="21"/>
-              </w:rPr>
-              <w:t xml:space="preserve"/>
+              <w:jc w:val="center"/>
+            </w:pPr>
+            <w:r>
+              <w:rPr>
+                <w:rFonts w:ascii="Times New Roman" w:eastAsia="SimSun" w:hAnsi="Times New Roman"/>
+                <w:b w:val="false"/>
+                <w:bCs w:val="false"/>
+                <w:sz w:val="21"/>
+                <w:szCs w:val="21"/>
+              </w:rPr>
+              <w:t xml:space="preserve">A$1,482.81</w:t>
             </w:r>
           </w:p>
         </w:tc>
@@ -4536,17 +4587,17 @@
           </w:tcPr>
           <w:p>
             <w:pPr>
-              <w:jc w:val="left"/>
-            </w:pPr>
-            <w:r>
-              <w:rPr>
-                <w:rFonts w:ascii="Times New Roman" w:eastAsia="SimSun" w:hAnsi="Times New Roman"/>
-                <w:b w:val="false"/>
-                <w:bCs w:val="false"/>
-                <w:sz w:val="21"/>
-                <w:szCs w:val="21"/>
-              </w:rPr>
-              <w:t xml:space="preserve"/>
+              <w:jc w:val="center"/>
+            </w:pPr>
+            <w:r>
+              <w:rPr>
+                <w:rFonts w:ascii="Times New Roman" w:eastAsia="SimSun" w:hAnsi="Times New Roman"/>
+                <w:b w:val="false"/>
+                <w:bCs w:val="false"/>
+                <w:sz w:val="21"/>
+                <w:szCs w:val="21"/>
+              </w:rPr>
+              <w:t xml:space="preserve">A$25,542.99</w:t>
             </w:r>
           </w:p>
         </w:tc>
@@ -4646,17 +4697,17 @@
           </w:tcPr>
           <w:p>
             <w:pPr>
-              <w:jc w:val="left"/>
-            </w:pPr>
-            <w:r>
-              <w:rPr>
-                <w:rFonts w:ascii="Times New Roman" w:eastAsia="SimSun" w:hAnsi="Times New Roman"/>
-                <w:b w:val="false"/>
-                <w:bCs w:val="false"/>
-                <w:sz w:val="21"/>
-                <w:szCs w:val="21"/>
-              </w:rPr>
-              <w:t xml:space="preserve"/>
+              <w:jc w:val="center"/>
+            </w:pPr>
+            <w:r>
+              <w:rPr>
+                <w:rFonts w:ascii="Times New Roman" w:eastAsia="SimSun" w:hAnsi="Times New Roman"/>
+                <w:b w:val="false"/>
+                <w:bCs w:val="false"/>
+                <w:sz w:val="21"/>
+                <w:szCs w:val="21"/>
+              </w:rPr>
+              <w:t xml:space="preserve">A$1,482.81</w:t>
             </w:r>
           </w:p>
         </w:tc>
@@ -4727,17 +4778,17 @@
           </w:tcPr>
           <w:p>
             <w:pPr>
-              <w:jc w:val="left"/>
-            </w:pPr>
-            <w:r>
-              <w:rPr>
-                <w:rFonts w:ascii="Times New Roman" w:eastAsia="SimSun" w:hAnsi="Times New Roman"/>
-                <w:b w:val="false"/>
-                <w:bCs w:val="false"/>
-                <w:sz w:val="21"/>
-                <w:szCs w:val="21"/>
-              </w:rPr>
-              <w:t xml:space="preserve"/>
+              <w:jc w:val="center"/>
+            </w:pPr>
+            <w:r>
+              <w:rPr>
+                <w:rFonts w:ascii="Times New Roman" w:eastAsia="SimSun" w:hAnsi="Times New Roman"/>
+                <w:b w:val="false"/>
+                <w:bCs w:val="false"/>
+                <w:sz w:val="21"/>
+                <w:szCs w:val="21"/>
+              </w:rPr>
+              <w:t xml:space="preserve">A$24,315.61</w:t>
             </w:r>
           </w:p>
         </w:tc>
@@ -4837,17 +4888,17 @@
           </w:tcPr>
           <w:p>
             <w:pPr>
-              <w:jc w:val="left"/>
-            </w:pPr>
-            <w:r>
-              <w:rPr>
-                <w:rFonts w:ascii="Times New Roman" w:eastAsia="SimSun" w:hAnsi="Times New Roman"/>
-                <w:b w:val="false"/>
-                <w:bCs w:val="false"/>
-                <w:sz w:val="21"/>
-                <w:szCs w:val="21"/>
-              </w:rPr>
-              <w:t xml:space="preserve"/>
+              <w:jc w:val="center"/>
+            </w:pPr>
+            <w:r>
+              <w:rPr>
+                <w:rFonts w:ascii="Times New Roman" w:eastAsia="SimSun" w:hAnsi="Times New Roman"/>
+                <w:b w:val="false"/>
+                <w:bCs w:val="false"/>
+                <w:sz w:val="21"/>
+                <w:szCs w:val="21"/>
+              </w:rPr>
+              <w:t xml:space="preserve">A$1,482.81</w:t>
             </w:r>
           </w:p>
         </w:tc>
@@ -4918,17 +4969,17 @@
           </w:tcPr>
           <w:p>
             <w:pPr>
-              <w:jc w:val="left"/>
-            </w:pPr>
-            <w:r>
-              <w:rPr>
-                <w:rFonts w:ascii="Times New Roman" w:eastAsia="SimSun" w:hAnsi="Times New Roman"/>
-                <w:b w:val="false"/>
-                <w:bCs w:val="false"/>
-                <w:sz w:val="21"/>
-                <w:szCs w:val="21"/>
-              </w:rPr>
-              <w:t xml:space="preserve"/>
+              <w:jc w:val="center"/>
+            </w:pPr>
+            <w:r>
+              <w:rPr>
+                <w:rFonts w:ascii="Times New Roman" w:eastAsia="SimSun" w:hAnsi="Times New Roman"/>
+                <w:b w:val="false"/>
+                <w:bCs w:val="false"/>
+                <w:sz w:val="21"/>
+                <w:szCs w:val="21"/>
+              </w:rPr>
+              <w:t xml:space="preserve">A$23,075.96</w:t>
             </w:r>
           </w:p>
         </w:tc>
@@ -5028,17 +5079,17 @@
           </w:tcPr>
           <w:p>
             <w:pPr>
-              <w:jc w:val="left"/>
-            </w:pPr>
-            <w:r>
-              <w:rPr>
-                <w:rFonts w:ascii="Times New Roman" w:eastAsia="SimSun" w:hAnsi="Times New Roman"/>
-                <w:b w:val="false"/>
-                <w:bCs w:val="false"/>
-                <w:sz w:val="21"/>
-                <w:szCs w:val="21"/>
-              </w:rPr>
-              <w:t xml:space="preserve"/>
+              <w:jc w:val="center"/>
+            </w:pPr>
+            <w:r>
+              <w:rPr>
+                <w:rFonts w:ascii="Times New Roman" w:eastAsia="SimSun" w:hAnsi="Times New Roman"/>
+                <w:b w:val="false"/>
+                <w:bCs w:val="false"/>
+                <w:sz w:val="21"/>
+                <w:szCs w:val="21"/>
+              </w:rPr>
+              <w:t xml:space="preserve">A$1,482.81</w:t>
             </w:r>
           </w:p>
         </w:tc>
@@ -5109,17 +5160,17 @@
           </w:tcPr>
           <w:p>
             <w:pPr>
-              <w:jc w:val="left"/>
-            </w:pPr>
-            <w:r>
-              <w:rPr>
-                <w:rFonts w:ascii="Times New Roman" w:eastAsia="SimSun" w:hAnsi="Times New Roman"/>
-                <w:b w:val="false"/>
-                <w:bCs w:val="false"/>
-                <w:sz w:val="21"/>
-                <w:szCs w:val="21"/>
-              </w:rPr>
-              <w:t xml:space="preserve"/>
+              <w:jc w:val="center"/>
+            </w:pPr>
+            <w:r>
+              <w:rPr>
+                <w:rFonts w:ascii="Times New Roman" w:eastAsia="SimSun" w:hAnsi="Times New Roman"/>
+                <w:b w:val="false"/>
+                <w:bCs w:val="false"/>
+                <w:sz w:val="21"/>
+                <w:szCs w:val="21"/>
+              </w:rPr>
+              <w:t xml:space="preserve">A$21,823.91</w:t>
             </w:r>
           </w:p>
         </w:tc>
@@ -5219,17 +5270,17 @@
           </w:tcPr>
           <w:p>
             <w:pPr>
-              <w:jc w:val="left"/>
-            </w:pPr>
-            <w:r>
-              <w:rPr>
-                <w:rFonts w:ascii="Times New Roman" w:eastAsia="SimSun" w:hAnsi="Times New Roman"/>
-                <w:b w:val="false"/>
-                <w:bCs w:val="false"/>
-                <w:sz w:val="21"/>
-                <w:szCs w:val="21"/>
-              </w:rPr>
-              <w:t xml:space="preserve"/>
+              <w:jc w:val="center"/>
+            </w:pPr>
+            <w:r>
+              <w:rPr>
+                <w:rFonts w:ascii="Times New Roman" w:eastAsia="SimSun" w:hAnsi="Times New Roman"/>
+                <w:b w:val="false"/>
+                <w:bCs w:val="false"/>
+                <w:sz w:val="21"/>
+                <w:szCs w:val="21"/>
+              </w:rPr>
+              <w:t xml:space="preserve">A$1,482.81</w:t>
             </w:r>
           </w:p>
         </w:tc>
@@ -5300,17 +5351,17 @@
           </w:tcPr>
           <w:p>
             <w:pPr>
-              <w:jc w:val="left"/>
-            </w:pPr>
-            <w:r>
-              <w:rPr>
-                <w:rFonts w:ascii="Times New Roman" w:eastAsia="SimSun" w:hAnsi="Times New Roman"/>
-                <w:b w:val="false"/>
-                <w:bCs w:val="false"/>
-                <w:sz w:val="21"/>
-                <w:szCs w:val="21"/>
-              </w:rPr>
-              <w:t xml:space="preserve"/>
+              <w:jc w:val="center"/>
+            </w:pPr>
+            <w:r>
+              <w:rPr>
+                <w:rFonts w:ascii="Times New Roman" w:eastAsia="SimSun" w:hAnsi="Times New Roman"/>
+                <w:b w:val="false"/>
+                <w:bCs w:val="false"/>
+                <w:sz w:val="21"/>
+                <w:szCs w:val="21"/>
+              </w:rPr>
+              <w:t xml:space="preserve">A$20,559.34</w:t>
             </w:r>
           </w:p>
         </w:tc>
@@ -5410,17 +5461,17 @@
           </w:tcPr>
           <w:p>
             <w:pPr>
-              <w:jc w:val="left"/>
-            </w:pPr>
-            <w:r>
-              <w:rPr>
-                <w:rFonts w:ascii="Times New Roman" w:eastAsia="SimSun" w:hAnsi="Times New Roman"/>
-                <w:b w:val="false"/>
-                <w:bCs w:val="false"/>
-                <w:sz w:val="21"/>
-                <w:szCs w:val="21"/>
-              </w:rPr>
-              <w:t xml:space="preserve"/>
+              <w:jc w:val="center"/>
+            </w:pPr>
+            <w:r>
+              <w:rPr>
+                <w:rFonts w:ascii="Times New Roman" w:eastAsia="SimSun" w:hAnsi="Times New Roman"/>
+                <w:b w:val="false"/>
+                <w:bCs w:val="false"/>
+                <w:sz w:val="21"/>
+                <w:szCs w:val="21"/>
+              </w:rPr>
+              <w:t xml:space="preserve">A$1,482.81</w:t>
             </w:r>
           </w:p>
         </w:tc>
@@ -5491,17 +5542,17 @@
           </w:tcPr>
           <w:p>
             <w:pPr>
-              <w:jc w:val="left"/>
-            </w:pPr>
-            <w:r>
-              <w:rPr>
-                <w:rFonts w:ascii="Times New Roman" w:eastAsia="SimSun" w:hAnsi="Times New Roman"/>
-                <w:b w:val="false"/>
-                <w:bCs w:val="false"/>
-                <w:sz w:val="21"/>
-                <w:szCs w:val="21"/>
-              </w:rPr>
-              <w:t xml:space="preserve"/>
+              <w:jc w:val="center"/>
+            </w:pPr>
+            <w:r>
+              <w:rPr>
+                <w:rFonts w:ascii="Times New Roman" w:eastAsia="SimSun" w:hAnsi="Times New Roman"/>
+                <w:b w:val="false"/>
+                <w:bCs w:val="false"/>
+                <w:sz w:val="21"/>
+                <w:szCs w:val="21"/>
+              </w:rPr>
+              <w:t xml:space="preserve">A$19,282.12</w:t>
             </w:r>
           </w:p>
         </w:tc>
@@ -5601,17 +5652,17 @@
           </w:tcPr>
           <w:p>
             <w:pPr>
-              <w:jc w:val="left"/>
-            </w:pPr>
-            <w:r>
-              <w:rPr>
-                <w:rFonts w:ascii="Times New Roman" w:eastAsia="SimSun" w:hAnsi="Times New Roman"/>
-                <w:b w:val="false"/>
-                <w:bCs w:val="false"/>
-                <w:sz w:val="21"/>
-                <w:szCs w:val="21"/>
-              </w:rPr>
-              <w:t xml:space="preserve"/>
+              <w:jc w:val="center"/>
+            </w:pPr>
+            <w:r>
+              <w:rPr>
+                <w:rFonts w:ascii="Times New Roman" w:eastAsia="SimSun" w:hAnsi="Times New Roman"/>
+                <w:b w:val="false"/>
+                <w:bCs w:val="false"/>
+                <w:sz w:val="21"/>
+                <w:szCs w:val="21"/>
+              </w:rPr>
+              <w:t xml:space="preserve">A$1,482.81</w:t>
             </w:r>
           </w:p>
         </w:tc>
@@ -5682,17 +5733,17 @@
           </w:tcPr>
           <w:p>
             <w:pPr>
-              <w:jc w:val="left"/>
-            </w:pPr>
-            <w:r>
-              <w:rPr>
-                <w:rFonts w:ascii="Times New Roman" w:eastAsia="SimSun" w:hAnsi="Times New Roman"/>
-                <w:b w:val="false"/>
-                <w:bCs w:val="false"/>
-                <w:sz w:val="21"/>
-                <w:szCs w:val="21"/>
-              </w:rPr>
-              <w:t xml:space="preserve"/>
+              <w:jc w:val="center"/>
+            </w:pPr>
+            <w:r>
+              <w:rPr>
+                <w:rFonts w:ascii="Times New Roman" w:eastAsia="SimSun" w:hAnsi="Times New Roman"/>
+                <w:b w:val="false"/>
+                <w:bCs w:val="false"/>
+                <w:sz w:val="21"/>
+                <w:szCs w:val="21"/>
+              </w:rPr>
+              <w:t xml:space="preserve">A$17,992.13</w:t>
             </w:r>
           </w:p>
         </w:tc>
@@ -5792,17 +5843,17 @@
           </w:tcPr>
           <w:p>
             <w:pPr>
-              <w:jc w:val="left"/>
-            </w:pPr>
-            <w:r>
-              <w:rPr>
-                <w:rFonts w:ascii="Times New Roman" w:eastAsia="SimSun" w:hAnsi="Times New Roman"/>
-                <w:b w:val="false"/>
-                <w:bCs w:val="false"/>
-                <w:sz w:val="21"/>
-                <w:szCs w:val="21"/>
-              </w:rPr>
-              <w:t xml:space="preserve"/>
+              <w:jc w:val="center"/>
+            </w:pPr>
+            <w:r>
+              <w:rPr>
+                <w:rFonts w:ascii="Times New Roman" w:eastAsia="SimSun" w:hAnsi="Times New Roman"/>
+                <w:b w:val="false"/>
+                <w:bCs w:val="false"/>
+                <w:sz w:val="21"/>
+                <w:szCs w:val="21"/>
+              </w:rPr>
+              <w:t xml:space="preserve">A$1,482.81</w:t>
             </w:r>
           </w:p>
         </w:tc>
@@ -5873,17 +5924,2309 @@
           </w:tcPr>
           <w:p>
             <w:pPr>
-              <w:jc w:val="left"/>
-            </w:pPr>
-            <w:r>
-              <w:rPr>
-                <w:rFonts w:ascii="Times New Roman" w:eastAsia="SimSun" w:hAnsi="Times New Roman"/>
-                <w:b w:val="false"/>
-                <w:bCs w:val="false"/>
-                <w:sz w:val="21"/>
-                <w:szCs w:val="21"/>
-              </w:rPr>
-              <w:t xml:space="preserve"/>
+              <w:jc w:val="center"/>
+            </w:pPr>
+            <w:r>
+              <w:rPr>
+                <w:rFonts w:ascii="Times New Roman" w:eastAsia="SimSun" w:hAnsi="Times New Roman"/>
+                <w:b w:val="false"/>
+                <w:bCs w:val="false"/>
+                <w:sz w:val="21"/>
+                <w:szCs w:val="21"/>
+              </w:rPr>
+              <w:t xml:space="preserve">A$16,689.24</w:t>
+            </w:r>
+          </w:p>
+        </w:tc>
+        <w:tc>
+          <w:tcPr>
+            <w:tcW w:type="dxa" w:w="1126"/>
+            <w:tcMar>
+              <w:top w:type="dxa" w:w="70"/>
+              <w:left w:type="dxa" w:w="110"/>
+              <w:bottom w:type="dxa" w:w="70"/>
+              <w:right w:type="dxa" w:w="110"/>
+            </w:tcMar>
+            <w:vAlign w:val="center"/>
+          </w:tcPr>
+          <w:p>
+            <w:pPr>
+              <w:jc w:val="left"/>
+            </w:pPr>
+            <w:r>
+              <w:rPr>
+                <w:rFonts w:ascii="Times New Roman" w:eastAsia="SimSun" w:hAnsi="Times New Roman"/>
+                <w:b w:val="false"/>
+                <w:bCs w:val="false"/>
+                <w:sz w:val="21"/>
+                <w:szCs w:val="21"/>
+              </w:rPr>
+              <w:t xml:space="preserve"/>
+            </w:r>
+          </w:p>
+        </w:tc>
+      </w:tr>
+      <w:tr>
+        <w:tc>
+          <w:tcPr>
+            <w:tcW w:type="dxa" w:w="600"/>
+            <w:tcMar>
+              <w:top w:type="dxa" w:w="70"/>
+              <w:left w:type="dxa" w:w="110"/>
+              <w:bottom w:type="dxa" w:w="70"/>
+              <w:right w:type="dxa" w:w="110"/>
+            </w:tcMar>
+            <w:vAlign w:val="center"/>
+          </w:tcPr>
+          <w:p>
+            <w:pPr>
+              <w:jc w:val="center"/>
+            </w:pPr>
+            <w:r>
+              <w:rPr>
+                <w:rFonts w:ascii="Times New Roman" w:eastAsia="SimSun" w:hAnsi="Times New Roman"/>
+                <w:b w:val="false"/>
+                <w:bCs w:val="false"/>
+                <w:sz w:val="21"/>
+                <w:szCs w:val="21"/>
+              </w:rPr>
+              <w:t xml:space="preserve">13</w:t>
+            </w:r>
+          </w:p>
+        </w:tc>
+        <w:tc>
+          <w:tcPr>
+            <w:tcW w:type="dxa" w:w="1500"/>
+            <w:tcMar>
+              <w:top w:type="dxa" w:w="70"/>
+              <w:left w:type="dxa" w:w="110"/>
+              <w:bottom w:type="dxa" w:w="70"/>
+              <w:right w:type="dxa" w:w="110"/>
+            </w:tcMar>
+            <w:vAlign w:val="center"/>
+          </w:tcPr>
+          <w:p>
+            <w:pPr>
+              <w:jc w:val="left"/>
+            </w:pPr>
+            <w:r>
+              <w:rPr>
+                <w:rFonts w:ascii="Times New Roman" w:eastAsia="SimSun" w:hAnsi="Times New Roman"/>
+                <w:b w:val="false"/>
+                <w:bCs w:val="false"/>
+                <w:sz w:val="21"/>
+                <w:szCs w:val="21"/>
+              </w:rPr>
+              <w:t xml:space="preserve"/>
+            </w:r>
+          </w:p>
+        </w:tc>
+        <w:tc>
+          <w:tcPr>
+            <w:tcW w:type="dxa" w:w="1400"/>
+            <w:tcMar>
+              <w:top w:type="dxa" w:w="70"/>
+              <w:left w:type="dxa" w:w="110"/>
+              <w:bottom w:type="dxa" w:w="70"/>
+              <w:right w:type="dxa" w:w="110"/>
+            </w:tcMar>
+            <w:vAlign w:val="center"/>
+          </w:tcPr>
+          <w:p>
+            <w:pPr>
+              <w:jc w:val="center"/>
+            </w:pPr>
+            <w:r>
+              <w:rPr>
+                <w:rFonts w:ascii="Times New Roman" w:eastAsia="SimSun" w:hAnsi="Times New Roman"/>
+                <w:b w:val="false"/>
+                <w:bCs w:val="false"/>
+                <w:sz w:val="21"/>
+                <w:szCs w:val="21"/>
+              </w:rPr>
+              <w:t xml:space="preserve">A$1,482.81</w:t>
+            </w:r>
+          </w:p>
+        </w:tc>
+        <w:tc>
+          <w:tcPr>
+            <w:tcW w:type="dxa" w:w="1500"/>
+            <w:tcMar>
+              <w:top w:type="dxa" w:w="70"/>
+              <w:left w:type="dxa" w:w="110"/>
+              <w:bottom w:type="dxa" w:w="70"/>
+              <w:right w:type="dxa" w:w="110"/>
+            </w:tcMar>
+            <w:vAlign w:val="center"/>
+          </w:tcPr>
+          <w:p>
+            <w:pPr>
+              <w:jc w:val="left"/>
+            </w:pPr>
+            <w:r>
+              <w:rPr>
+                <w:rFonts w:ascii="Times New Roman" w:eastAsia="SimSun" w:hAnsi="Times New Roman"/>
+                <w:b w:val="false"/>
+                <w:bCs w:val="false"/>
+                <w:sz w:val="21"/>
+                <w:szCs w:val="21"/>
+              </w:rPr>
+              <w:t xml:space="preserve"/>
+            </w:r>
+          </w:p>
+        </w:tc>
+        <w:tc>
+          <w:tcPr>
+            <w:tcW w:type="dxa" w:w="1400"/>
+            <w:tcMar>
+              <w:top w:type="dxa" w:w="70"/>
+              <w:left w:type="dxa" w:w="110"/>
+              <w:bottom w:type="dxa" w:w="70"/>
+              <w:right w:type="dxa" w:w="110"/>
+            </w:tcMar>
+            <w:vAlign w:val="center"/>
+          </w:tcPr>
+          <w:p>
+            <w:pPr>
+              <w:jc w:val="left"/>
+            </w:pPr>
+            <w:r>
+              <w:rPr>
+                <w:rFonts w:ascii="Times New Roman" w:eastAsia="SimSun" w:hAnsi="Times New Roman"/>
+                <w:b w:val="false"/>
+                <w:bCs w:val="false"/>
+                <w:sz w:val="21"/>
+                <w:szCs w:val="21"/>
+              </w:rPr>
+              <w:t xml:space="preserve"/>
+            </w:r>
+          </w:p>
+        </w:tc>
+        <w:tc>
+          <w:tcPr>
+            <w:tcW w:type="dxa" w:w="1500"/>
+            <w:tcMar>
+              <w:top w:type="dxa" w:w="70"/>
+              <w:left w:type="dxa" w:w="110"/>
+              <w:bottom w:type="dxa" w:w="70"/>
+              <w:right w:type="dxa" w:w="110"/>
+            </w:tcMar>
+            <w:vAlign w:val="center"/>
+          </w:tcPr>
+          <w:p>
+            <w:pPr>
+              <w:jc w:val="center"/>
+            </w:pPr>
+            <w:r>
+              <w:rPr>
+                <w:rFonts w:ascii="Times New Roman" w:eastAsia="SimSun" w:hAnsi="Times New Roman"/>
+                <w:b w:val="false"/>
+                <w:bCs w:val="false"/>
+                <w:sz w:val="21"/>
+                <w:szCs w:val="21"/>
+              </w:rPr>
+              <w:t xml:space="preserve">A$15,373.32</w:t>
+            </w:r>
+          </w:p>
+        </w:tc>
+        <w:tc>
+          <w:tcPr>
+            <w:tcW w:type="dxa" w:w="1126"/>
+            <w:tcMar>
+              <w:top w:type="dxa" w:w="70"/>
+              <w:left w:type="dxa" w:w="110"/>
+              <w:bottom w:type="dxa" w:w="70"/>
+              <w:right w:type="dxa" w:w="110"/>
+            </w:tcMar>
+            <w:vAlign w:val="center"/>
+          </w:tcPr>
+          <w:p>
+            <w:pPr>
+              <w:jc w:val="left"/>
+            </w:pPr>
+            <w:r>
+              <w:rPr>
+                <w:rFonts w:ascii="Times New Roman" w:eastAsia="SimSun" w:hAnsi="Times New Roman"/>
+                <w:b w:val="false"/>
+                <w:bCs w:val="false"/>
+                <w:sz w:val="21"/>
+                <w:szCs w:val="21"/>
+              </w:rPr>
+              <w:t xml:space="preserve"/>
+            </w:r>
+          </w:p>
+        </w:tc>
+      </w:tr>
+      <w:tr>
+        <w:tc>
+          <w:tcPr>
+            <w:tcW w:type="dxa" w:w="600"/>
+            <w:tcMar>
+              <w:top w:type="dxa" w:w="70"/>
+              <w:left w:type="dxa" w:w="110"/>
+              <w:bottom w:type="dxa" w:w="70"/>
+              <w:right w:type="dxa" w:w="110"/>
+            </w:tcMar>
+            <w:vAlign w:val="center"/>
+          </w:tcPr>
+          <w:p>
+            <w:pPr>
+              <w:jc w:val="center"/>
+            </w:pPr>
+            <w:r>
+              <w:rPr>
+                <w:rFonts w:ascii="Times New Roman" w:eastAsia="SimSun" w:hAnsi="Times New Roman"/>
+                <w:b w:val="false"/>
+                <w:bCs w:val="false"/>
+                <w:sz w:val="21"/>
+                <w:szCs w:val="21"/>
+              </w:rPr>
+              <w:t xml:space="preserve">14</w:t>
+            </w:r>
+          </w:p>
+        </w:tc>
+        <w:tc>
+          <w:tcPr>
+            <w:tcW w:type="dxa" w:w="1500"/>
+            <w:tcMar>
+              <w:top w:type="dxa" w:w="70"/>
+              <w:left w:type="dxa" w:w="110"/>
+              <w:bottom w:type="dxa" w:w="70"/>
+              <w:right w:type="dxa" w:w="110"/>
+            </w:tcMar>
+            <w:vAlign w:val="center"/>
+          </w:tcPr>
+          <w:p>
+            <w:pPr>
+              <w:jc w:val="left"/>
+            </w:pPr>
+            <w:r>
+              <w:rPr>
+                <w:rFonts w:ascii="Times New Roman" w:eastAsia="SimSun" w:hAnsi="Times New Roman"/>
+                <w:b w:val="false"/>
+                <w:bCs w:val="false"/>
+                <w:sz w:val="21"/>
+                <w:szCs w:val="21"/>
+              </w:rPr>
+              <w:t xml:space="preserve"/>
+            </w:r>
+          </w:p>
+        </w:tc>
+        <w:tc>
+          <w:tcPr>
+            <w:tcW w:type="dxa" w:w="1400"/>
+            <w:tcMar>
+              <w:top w:type="dxa" w:w="70"/>
+              <w:left w:type="dxa" w:w="110"/>
+              <w:bottom w:type="dxa" w:w="70"/>
+              <w:right w:type="dxa" w:w="110"/>
+            </w:tcMar>
+            <w:vAlign w:val="center"/>
+          </w:tcPr>
+          <w:p>
+            <w:pPr>
+              <w:jc w:val="center"/>
+            </w:pPr>
+            <w:r>
+              <w:rPr>
+                <w:rFonts w:ascii="Times New Roman" w:eastAsia="SimSun" w:hAnsi="Times New Roman"/>
+                <w:b w:val="false"/>
+                <w:bCs w:val="false"/>
+                <w:sz w:val="21"/>
+                <w:szCs w:val="21"/>
+              </w:rPr>
+              <w:t xml:space="preserve">A$1,482.81</w:t>
+            </w:r>
+          </w:p>
+        </w:tc>
+        <w:tc>
+          <w:tcPr>
+            <w:tcW w:type="dxa" w:w="1500"/>
+            <w:tcMar>
+              <w:top w:type="dxa" w:w="70"/>
+              <w:left w:type="dxa" w:w="110"/>
+              <w:bottom w:type="dxa" w:w="70"/>
+              <w:right w:type="dxa" w:w="110"/>
+            </w:tcMar>
+            <w:vAlign w:val="center"/>
+          </w:tcPr>
+          <w:p>
+            <w:pPr>
+              <w:jc w:val="left"/>
+            </w:pPr>
+            <w:r>
+              <w:rPr>
+                <w:rFonts w:ascii="Times New Roman" w:eastAsia="SimSun" w:hAnsi="Times New Roman"/>
+                <w:b w:val="false"/>
+                <w:bCs w:val="false"/>
+                <w:sz w:val="21"/>
+                <w:szCs w:val="21"/>
+              </w:rPr>
+              <w:t xml:space="preserve"/>
+            </w:r>
+          </w:p>
+        </w:tc>
+        <w:tc>
+          <w:tcPr>
+            <w:tcW w:type="dxa" w:w="1400"/>
+            <w:tcMar>
+              <w:top w:type="dxa" w:w="70"/>
+              <w:left w:type="dxa" w:w="110"/>
+              <w:bottom w:type="dxa" w:w="70"/>
+              <w:right w:type="dxa" w:w="110"/>
+            </w:tcMar>
+            <w:vAlign w:val="center"/>
+          </w:tcPr>
+          <w:p>
+            <w:pPr>
+              <w:jc w:val="left"/>
+            </w:pPr>
+            <w:r>
+              <w:rPr>
+                <w:rFonts w:ascii="Times New Roman" w:eastAsia="SimSun" w:hAnsi="Times New Roman"/>
+                <w:b w:val="false"/>
+                <w:bCs w:val="false"/>
+                <w:sz w:val="21"/>
+                <w:szCs w:val="21"/>
+              </w:rPr>
+              <w:t xml:space="preserve"/>
+            </w:r>
+          </w:p>
+        </w:tc>
+        <w:tc>
+          <w:tcPr>
+            <w:tcW w:type="dxa" w:w="1500"/>
+            <w:tcMar>
+              <w:top w:type="dxa" w:w="70"/>
+              <w:left w:type="dxa" w:w="110"/>
+              <w:bottom w:type="dxa" w:w="70"/>
+              <w:right w:type="dxa" w:w="110"/>
+            </w:tcMar>
+            <w:vAlign w:val="center"/>
+          </w:tcPr>
+          <w:p>
+            <w:pPr>
+              <w:jc w:val="center"/>
+            </w:pPr>
+            <w:r>
+              <w:rPr>
+                <w:rFonts w:ascii="Times New Roman" w:eastAsia="SimSun" w:hAnsi="Times New Roman"/>
+                <w:b w:val="false"/>
+                <w:bCs w:val="false"/>
+                <w:sz w:val="21"/>
+                <w:szCs w:val="21"/>
+              </w:rPr>
+              <w:t xml:space="preserve">A$14,044.24</w:t>
+            </w:r>
+          </w:p>
+        </w:tc>
+        <w:tc>
+          <w:tcPr>
+            <w:tcW w:type="dxa" w:w="1126"/>
+            <w:tcMar>
+              <w:top w:type="dxa" w:w="70"/>
+              <w:left w:type="dxa" w:w="110"/>
+              <w:bottom w:type="dxa" w:w="70"/>
+              <w:right w:type="dxa" w:w="110"/>
+            </w:tcMar>
+            <w:vAlign w:val="center"/>
+          </w:tcPr>
+          <w:p>
+            <w:pPr>
+              <w:jc w:val="left"/>
+            </w:pPr>
+            <w:r>
+              <w:rPr>
+                <w:rFonts w:ascii="Times New Roman" w:eastAsia="SimSun" w:hAnsi="Times New Roman"/>
+                <w:b w:val="false"/>
+                <w:bCs w:val="false"/>
+                <w:sz w:val="21"/>
+                <w:szCs w:val="21"/>
+              </w:rPr>
+              <w:t xml:space="preserve"/>
+            </w:r>
+          </w:p>
+        </w:tc>
+      </w:tr>
+      <w:tr>
+        <w:tc>
+          <w:tcPr>
+            <w:tcW w:type="dxa" w:w="600"/>
+            <w:tcMar>
+              <w:top w:type="dxa" w:w="70"/>
+              <w:left w:type="dxa" w:w="110"/>
+              <w:bottom w:type="dxa" w:w="70"/>
+              <w:right w:type="dxa" w:w="110"/>
+            </w:tcMar>
+            <w:vAlign w:val="center"/>
+          </w:tcPr>
+          <w:p>
+            <w:pPr>
+              <w:jc w:val="center"/>
+            </w:pPr>
+            <w:r>
+              <w:rPr>
+                <w:rFonts w:ascii="Times New Roman" w:eastAsia="SimSun" w:hAnsi="Times New Roman"/>
+                <w:b w:val="false"/>
+                <w:bCs w:val="false"/>
+                <w:sz w:val="21"/>
+                <w:szCs w:val="21"/>
+              </w:rPr>
+              <w:t xml:space="preserve">15</w:t>
+            </w:r>
+          </w:p>
+        </w:tc>
+        <w:tc>
+          <w:tcPr>
+            <w:tcW w:type="dxa" w:w="1500"/>
+            <w:tcMar>
+              <w:top w:type="dxa" w:w="70"/>
+              <w:left w:type="dxa" w:w="110"/>
+              <w:bottom w:type="dxa" w:w="70"/>
+              <w:right w:type="dxa" w:w="110"/>
+            </w:tcMar>
+            <w:vAlign w:val="center"/>
+          </w:tcPr>
+          <w:p>
+            <w:pPr>
+              <w:jc w:val="left"/>
+            </w:pPr>
+            <w:r>
+              <w:rPr>
+                <w:rFonts w:ascii="Times New Roman" w:eastAsia="SimSun" w:hAnsi="Times New Roman"/>
+                <w:b w:val="false"/>
+                <w:bCs w:val="false"/>
+                <w:sz w:val="21"/>
+                <w:szCs w:val="21"/>
+              </w:rPr>
+              <w:t xml:space="preserve"/>
+            </w:r>
+          </w:p>
+        </w:tc>
+        <w:tc>
+          <w:tcPr>
+            <w:tcW w:type="dxa" w:w="1400"/>
+            <w:tcMar>
+              <w:top w:type="dxa" w:w="70"/>
+              <w:left w:type="dxa" w:w="110"/>
+              <w:bottom w:type="dxa" w:w="70"/>
+              <w:right w:type="dxa" w:w="110"/>
+            </w:tcMar>
+            <w:vAlign w:val="center"/>
+          </w:tcPr>
+          <w:p>
+            <w:pPr>
+              <w:jc w:val="center"/>
+            </w:pPr>
+            <w:r>
+              <w:rPr>
+                <w:rFonts w:ascii="Times New Roman" w:eastAsia="SimSun" w:hAnsi="Times New Roman"/>
+                <w:b w:val="false"/>
+                <w:bCs w:val="false"/>
+                <w:sz w:val="21"/>
+                <w:szCs w:val="21"/>
+              </w:rPr>
+              <w:t xml:space="preserve">A$1,482.81</w:t>
+            </w:r>
+          </w:p>
+        </w:tc>
+        <w:tc>
+          <w:tcPr>
+            <w:tcW w:type="dxa" w:w="1500"/>
+            <w:tcMar>
+              <w:top w:type="dxa" w:w="70"/>
+              <w:left w:type="dxa" w:w="110"/>
+              <w:bottom w:type="dxa" w:w="70"/>
+              <w:right w:type="dxa" w:w="110"/>
+            </w:tcMar>
+            <w:vAlign w:val="center"/>
+          </w:tcPr>
+          <w:p>
+            <w:pPr>
+              <w:jc w:val="left"/>
+            </w:pPr>
+            <w:r>
+              <w:rPr>
+                <w:rFonts w:ascii="Times New Roman" w:eastAsia="SimSun" w:hAnsi="Times New Roman"/>
+                <w:b w:val="false"/>
+                <w:bCs w:val="false"/>
+                <w:sz w:val="21"/>
+                <w:szCs w:val="21"/>
+              </w:rPr>
+              <w:t xml:space="preserve"/>
+            </w:r>
+          </w:p>
+        </w:tc>
+        <w:tc>
+          <w:tcPr>
+            <w:tcW w:type="dxa" w:w="1400"/>
+            <w:tcMar>
+              <w:top w:type="dxa" w:w="70"/>
+              <w:left w:type="dxa" w:w="110"/>
+              <w:bottom w:type="dxa" w:w="70"/>
+              <w:right w:type="dxa" w:w="110"/>
+            </w:tcMar>
+            <w:vAlign w:val="center"/>
+          </w:tcPr>
+          <w:p>
+            <w:pPr>
+              <w:jc w:val="left"/>
+            </w:pPr>
+            <w:r>
+              <w:rPr>
+                <w:rFonts w:ascii="Times New Roman" w:eastAsia="SimSun" w:hAnsi="Times New Roman"/>
+                <w:b w:val="false"/>
+                <w:bCs w:val="false"/>
+                <w:sz w:val="21"/>
+                <w:szCs w:val="21"/>
+              </w:rPr>
+              <w:t xml:space="preserve"/>
+            </w:r>
+          </w:p>
+        </w:tc>
+        <w:tc>
+          <w:tcPr>
+            <w:tcW w:type="dxa" w:w="1500"/>
+            <w:tcMar>
+              <w:top w:type="dxa" w:w="70"/>
+              <w:left w:type="dxa" w:w="110"/>
+              <w:bottom w:type="dxa" w:w="70"/>
+              <w:right w:type="dxa" w:w="110"/>
+            </w:tcMar>
+            <w:vAlign w:val="center"/>
+          </w:tcPr>
+          <w:p>
+            <w:pPr>
+              <w:jc w:val="center"/>
+            </w:pPr>
+            <w:r>
+              <w:rPr>
+                <w:rFonts w:ascii="Times New Roman" w:eastAsia="SimSun" w:hAnsi="Times New Roman"/>
+                <w:b w:val="false"/>
+                <w:bCs w:val="false"/>
+                <w:sz w:val="21"/>
+                <w:szCs w:val="21"/>
+              </w:rPr>
+              <w:t xml:space="preserve">A$12,701.87</w:t>
+            </w:r>
+          </w:p>
+        </w:tc>
+        <w:tc>
+          <w:tcPr>
+            <w:tcW w:type="dxa" w:w="1126"/>
+            <w:tcMar>
+              <w:top w:type="dxa" w:w="70"/>
+              <w:left w:type="dxa" w:w="110"/>
+              <w:bottom w:type="dxa" w:w="70"/>
+              <w:right w:type="dxa" w:w="110"/>
+            </w:tcMar>
+            <w:vAlign w:val="center"/>
+          </w:tcPr>
+          <w:p>
+            <w:pPr>
+              <w:jc w:val="left"/>
+            </w:pPr>
+            <w:r>
+              <w:rPr>
+                <w:rFonts w:ascii="Times New Roman" w:eastAsia="SimSun" w:hAnsi="Times New Roman"/>
+                <w:b w:val="false"/>
+                <w:bCs w:val="false"/>
+                <w:sz w:val="21"/>
+                <w:szCs w:val="21"/>
+              </w:rPr>
+              <w:t xml:space="preserve"/>
+            </w:r>
+          </w:p>
+        </w:tc>
+      </w:tr>
+      <w:tr>
+        <w:tc>
+          <w:tcPr>
+            <w:tcW w:type="dxa" w:w="600"/>
+            <w:tcMar>
+              <w:top w:type="dxa" w:w="70"/>
+              <w:left w:type="dxa" w:w="110"/>
+              <w:bottom w:type="dxa" w:w="70"/>
+              <w:right w:type="dxa" w:w="110"/>
+            </w:tcMar>
+            <w:vAlign w:val="center"/>
+          </w:tcPr>
+          <w:p>
+            <w:pPr>
+              <w:jc w:val="center"/>
+            </w:pPr>
+            <w:r>
+              <w:rPr>
+                <w:rFonts w:ascii="Times New Roman" w:eastAsia="SimSun" w:hAnsi="Times New Roman"/>
+                <w:b w:val="false"/>
+                <w:bCs w:val="false"/>
+                <w:sz w:val="21"/>
+                <w:szCs w:val="21"/>
+              </w:rPr>
+              <w:t xml:space="preserve">16</w:t>
+            </w:r>
+          </w:p>
+        </w:tc>
+        <w:tc>
+          <w:tcPr>
+            <w:tcW w:type="dxa" w:w="1500"/>
+            <w:tcMar>
+              <w:top w:type="dxa" w:w="70"/>
+              <w:left w:type="dxa" w:w="110"/>
+              <w:bottom w:type="dxa" w:w="70"/>
+              <w:right w:type="dxa" w:w="110"/>
+            </w:tcMar>
+            <w:vAlign w:val="center"/>
+          </w:tcPr>
+          <w:p>
+            <w:pPr>
+              <w:jc w:val="left"/>
+            </w:pPr>
+            <w:r>
+              <w:rPr>
+                <w:rFonts w:ascii="Times New Roman" w:eastAsia="SimSun" w:hAnsi="Times New Roman"/>
+                <w:b w:val="false"/>
+                <w:bCs w:val="false"/>
+                <w:sz w:val="21"/>
+                <w:szCs w:val="21"/>
+              </w:rPr>
+              <w:t xml:space="preserve"/>
+            </w:r>
+          </w:p>
+        </w:tc>
+        <w:tc>
+          <w:tcPr>
+            <w:tcW w:type="dxa" w:w="1400"/>
+            <w:tcMar>
+              <w:top w:type="dxa" w:w="70"/>
+              <w:left w:type="dxa" w:w="110"/>
+              <w:bottom w:type="dxa" w:w="70"/>
+              <w:right w:type="dxa" w:w="110"/>
+            </w:tcMar>
+            <w:vAlign w:val="center"/>
+          </w:tcPr>
+          <w:p>
+            <w:pPr>
+              <w:jc w:val="center"/>
+            </w:pPr>
+            <w:r>
+              <w:rPr>
+                <w:rFonts w:ascii="Times New Roman" w:eastAsia="SimSun" w:hAnsi="Times New Roman"/>
+                <w:b w:val="false"/>
+                <w:bCs w:val="false"/>
+                <w:sz w:val="21"/>
+                <w:szCs w:val="21"/>
+              </w:rPr>
+              <w:t xml:space="preserve">A$1,482.81</w:t>
+            </w:r>
+          </w:p>
+        </w:tc>
+        <w:tc>
+          <w:tcPr>
+            <w:tcW w:type="dxa" w:w="1500"/>
+            <w:tcMar>
+              <w:top w:type="dxa" w:w="70"/>
+              <w:left w:type="dxa" w:w="110"/>
+              <w:bottom w:type="dxa" w:w="70"/>
+              <w:right w:type="dxa" w:w="110"/>
+            </w:tcMar>
+            <w:vAlign w:val="center"/>
+          </w:tcPr>
+          <w:p>
+            <w:pPr>
+              <w:jc w:val="left"/>
+            </w:pPr>
+            <w:r>
+              <w:rPr>
+                <w:rFonts w:ascii="Times New Roman" w:eastAsia="SimSun" w:hAnsi="Times New Roman"/>
+                <w:b w:val="false"/>
+                <w:bCs w:val="false"/>
+                <w:sz w:val="21"/>
+                <w:szCs w:val="21"/>
+              </w:rPr>
+              <w:t xml:space="preserve"/>
+            </w:r>
+          </w:p>
+        </w:tc>
+        <w:tc>
+          <w:tcPr>
+            <w:tcW w:type="dxa" w:w="1400"/>
+            <w:tcMar>
+              <w:top w:type="dxa" w:w="70"/>
+              <w:left w:type="dxa" w:w="110"/>
+              <w:bottom w:type="dxa" w:w="70"/>
+              <w:right w:type="dxa" w:w="110"/>
+            </w:tcMar>
+            <w:vAlign w:val="center"/>
+          </w:tcPr>
+          <w:p>
+            <w:pPr>
+              <w:jc w:val="left"/>
+            </w:pPr>
+            <w:r>
+              <w:rPr>
+                <w:rFonts w:ascii="Times New Roman" w:eastAsia="SimSun" w:hAnsi="Times New Roman"/>
+                <w:b w:val="false"/>
+                <w:bCs w:val="false"/>
+                <w:sz w:val="21"/>
+                <w:szCs w:val="21"/>
+              </w:rPr>
+              <w:t xml:space="preserve"/>
+            </w:r>
+          </w:p>
+        </w:tc>
+        <w:tc>
+          <w:tcPr>
+            <w:tcW w:type="dxa" w:w="1500"/>
+            <w:tcMar>
+              <w:top w:type="dxa" w:w="70"/>
+              <w:left w:type="dxa" w:w="110"/>
+              <w:bottom w:type="dxa" w:w="70"/>
+              <w:right w:type="dxa" w:w="110"/>
+            </w:tcMar>
+            <w:vAlign w:val="center"/>
+          </w:tcPr>
+          <w:p>
+            <w:pPr>
+              <w:jc w:val="center"/>
+            </w:pPr>
+            <w:r>
+              <w:rPr>
+                <w:rFonts w:ascii="Times New Roman" w:eastAsia="SimSun" w:hAnsi="Times New Roman"/>
+                <w:b w:val="false"/>
+                <w:bCs w:val="false"/>
+                <w:sz w:val="21"/>
+                <w:szCs w:val="21"/>
+              </w:rPr>
+              <w:t xml:space="preserve">A$11,346.08</w:t>
+            </w:r>
+          </w:p>
+        </w:tc>
+        <w:tc>
+          <w:tcPr>
+            <w:tcW w:type="dxa" w:w="1126"/>
+            <w:tcMar>
+              <w:top w:type="dxa" w:w="70"/>
+              <w:left w:type="dxa" w:w="110"/>
+              <w:bottom w:type="dxa" w:w="70"/>
+              <w:right w:type="dxa" w:w="110"/>
+            </w:tcMar>
+            <w:vAlign w:val="center"/>
+          </w:tcPr>
+          <w:p>
+            <w:pPr>
+              <w:jc w:val="left"/>
+            </w:pPr>
+            <w:r>
+              <w:rPr>
+                <w:rFonts w:ascii="Times New Roman" w:eastAsia="SimSun" w:hAnsi="Times New Roman"/>
+                <w:b w:val="false"/>
+                <w:bCs w:val="false"/>
+                <w:sz w:val="21"/>
+                <w:szCs w:val="21"/>
+              </w:rPr>
+              <w:t xml:space="preserve"/>
+            </w:r>
+          </w:p>
+        </w:tc>
+      </w:tr>
+      <w:tr>
+        <w:tc>
+          <w:tcPr>
+            <w:tcW w:type="dxa" w:w="600"/>
+            <w:tcMar>
+              <w:top w:type="dxa" w:w="70"/>
+              <w:left w:type="dxa" w:w="110"/>
+              <w:bottom w:type="dxa" w:w="70"/>
+              <w:right w:type="dxa" w:w="110"/>
+            </w:tcMar>
+            <w:vAlign w:val="center"/>
+          </w:tcPr>
+          <w:p>
+            <w:pPr>
+              <w:jc w:val="center"/>
+            </w:pPr>
+            <w:r>
+              <w:rPr>
+                <w:rFonts w:ascii="Times New Roman" w:eastAsia="SimSun" w:hAnsi="Times New Roman"/>
+                <w:b w:val="false"/>
+                <w:bCs w:val="false"/>
+                <w:sz w:val="21"/>
+                <w:szCs w:val="21"/>
+              </w:rPr>
+              <w:t xml:space="preserve">17</w:t>
+            </w:r>
+          </w:p>
+        </w:tc>
+        <w:tc>
+          <w:tcPr>
+            <w:tcW w:type="dxa" w:w="1500"/>
+            <w:tcMar>
+              <w:top w:type="dxa" w:w="70"/>
+              <w:left w:type="dxa" w:w="110"/>
+              <w:bottom w:type="dxa" w:w="70"/>
+              <w:right w:type="dxa" w:w="110"/>
+            </w:tcMar>
+            <w:vAlign w:val="center"/>
+          </w:tcPr>
+          <w:p>
+            <w:pPr>
+              <w:jc w:val="left"/>
+            </w:pPr>
+            <w:r>
+              <w:rPr>
+                <w:rFonts w:ascii="Times New Roman" w:eastAsia="SimSun" w:hAnsi="Times New Roman"/>
+                <w:b w:val="false"/>
+                <w:bCs w:val="false"/>
+                <w:sz w:val="21"/>
+                <w:szCs w:val="21"/>
+              </w:rPr>
+              <w:t xml:space="preserve"/>
+            </w:r>
+          </w:p>
+        </w:tc>
+        <w:tc>
+          <w:tcPr>
+            <w:tcW w:type="dxa" w:w="1400"/>
+            <w:tcMar>
+              <w:top w:type="dxa" w:w="70"/>
+              <w:left w:type="dxa" w:w="110"/>
+              <w:bottom w:type="dxa" w:w="70"/>
+              <w:right w:type="dxa" w:w="110"/>
+            </w:tcMar>
+            <w:vAlign w:val="center"/>
+          </w:tcPr>
+          <w:p>
+            <w:pPr>
+              <w:jc w:val="center"/>
+            </w:pPr>
+            <w:r>
+              <w:rPr>
+                <w:rFonts w:ascii="Times New Roman" w:eastAsia="SimSun" w:hAnsi="Times New Roman"/>
+                <w:b w:val="false"/>
+                <w:bCs w:val="false"/>
+                <w:sz w:val="21"/>
+                <w:szCs w:val="21"/>
+              </w:rPr>
+              <w:t xml:space="preserve">A$1,482.81</w:t>
+            </w:r>
+          </w:p>
+        </w:tc>
+        <w:tc>
+          <w:tcPr>
+            <w:tcW w:type="dxa" w:w="1500"/>
+            <w:tcMar>
+              <w:top w:type="dxa" w:w="70"/>
+              <w:left w:type="dxa" w:w="110"/>
+              <w:bottom w:type="dxa" w:w="70"/>
+              <w:right w:type="dxa" w:w="110"/>
+            </w:tcMar>
+            <w:vAlign w:val="center"/>
+          </w:tcPr>
+          <w:p>
+            <w:pPr>
+              <w:jc w:val="left"/>
+            </w:pPr>
+            <w:r>
+              <w:rPr>
+                <w:rFonts w:ascii="Times New Roman" w:eastAsia="SimSun" w:hAnsi="Times New Roman"/>
+                <w:b w:val="false"/>
+                <w:bCs w:val="false"/>
+                <w:sz w:val="21"/>
+                <w:szCs w:val="21"/>
+              </w:rPr>
+              <w:t xml:space="preserve"/>
+            </w:r>
+          </w:p>
+        </w:tc>
+        <w:tc>
+          <w:tcPr>
+            <w:tcW w:type="dxa" w:w="1400"/>
+            <w:tcMar>
+              <w:top w:type="dxa" w:w="70"/>
+              <w:left w:type="dxa" w:w="110"/>
+              <w:bottom w:type="dxa" w:w="70"/>
+              <w:right w:type="dxa" w:w="110"/>
+            </w:tcMar>
+            <w:vAlign w:val="center"/>
+          </w:tcPr>
+          <w:p>
+            <w:pPr>
+              <w:jc w:val="left"/>
+            </w:pPr>
+            <w:r>
+              <w:rPr>
+                <w:rFonts w:ascii="Times New Roman" w:eastAsia="SimSun" w:hAnsi="Times New Roman"/>
+                <w:b w:val="false"/>
+                <w:bCs w:val="false"/>
+                <w:sz w:val="21"/>
+                <w:szCs w:val="21"/>
+              </w:rPr>
+              <w:t xml:space="preserve"/>
+            </w:r>
+          </w:p>
+        </w:tc>
+        <w:tc>
+          <w:tcPr>
+            <w:tcW w:type="dxa" w:w="1500"/>
+            <w:tcMar>
+              <w:top w:type="dxa" w:w="70"/>
+              <w:left w:type="dxa" w:w="110"/>
+              <w:bottom w:type="dxa" w:w="70"/>
+              <w:right w:type="dxa" w:w="110"/>
+            </w:tcMar>
+            <w:vAlign w:val="center"/>
+          </w:tcPr>
+          <w:p>
+            <w:pPr>
+              <w:jc w:val="center"/>
+            </w:pPr>
+            <w:r>
+              <w:rPr>
+                <w:rFonts w:ascii="Times New Roman" w:eastAsia="SimSun" w:hAnsi="Times New Roman"/>
+                <w:b w:val="false"/>
+                <w:bCs w:val="false"/>
+                <w:sz w:val="21"/>
+                <w:szCs w:val="21"/>
+              </w:rPr>
+              <w:t xml:space="preserve">A$9,976.73</w:t>
+            </w:r>
+          </w:p>
+        </w:tc>
+        <w:tc>
+          <w:tcPr>
+            <w:tcW w:type="dxa" w:w="1126"/>
+            <w:tcMar>
+              <w:top w:type="dxa" w:w="70"/>
+              <w:left w:type="dxa" w:w="110"/>
+              <w:bottom w:type="dxa" w:w="70"/>
+              <w:right w:type="dxa" w:w="110"/>
+            </w:tcMar>
+            <w:vAlign w:val="center"/>
+          </w:tcPr>
+          <w:p>
+            <w:pPr>
+              <w:jc w:val="left"/>
+            </w:pPr>
+            <w:r>
+              <w:rPr>
+                <w:rFonts w:ascii="Times New Roman" w:eastAsia="SimSun" w:hAnsi="Times New Roman"/>
+                <w:b w:val="false"/>
+                <w:bCs w:val="false"/>
+                <w:sz w:val="21"/>
+                <w:szCs w:val="21"/>
+              </w:rPr>
+              <w:t xml:space="preserve"/>
+            </w:r>
+          </w:p>
+        </w:tc>
+      </w:tr>
+      <w:tr>
+        <w:tc>
+          <w:tcPr>
+            <w:tcW w:type="dxa" w:w="600"/>
+            <w:tcMar>
+              <w:top w:type="dxa" w:w="70"/>
+              <w:left w:type="dxa" w:w="110"/>
+              <w:bottom w:type="dxa" w:w="70"/>
+              <w:right w:type="dxa" w:w="110"/>
+            </w:tcMar>
+            <w:vAlign w:val="center"/>
+          </w:tcPr>
+          <w:p>
+            <w:pPr>
+              <w:jc w:val="center"/>
+            </w:pPr>
+            <w:r>
+              <w:rPr>
+                <w:rFonts w:ascii="Times New Roman" w:eastAsia="SimSun" w:hAnsi="Times New Roman"/>
+                <w:b w:val="false"/>
+                <w:bCs w:val="false"/>
+                <w:sz w:val="21"/>
+                <w:szCs w:val="21"/>
+              </w:rPr>
+              <w:t xml:space="preserve">18</w:t>
+            </w:r>
+          </w:p>
+        </w:tc>
+        <w:tc>
+          <w:tcPr>
+            <w:tcW w:type="dxa" w:w="1500"/>
+            <w:tcMar>
+              <w:top w:type="dxa" w:w="70"/>
+              <w:left w:type="dxa" w:w="110"/>
+              <w:bottom w:type="dxa" w:w="70"/>
+              <w:right w:type="dxa" w:w="110"/>
+            </w:tcMar>
+            <w:vAlign w:val="center"/>
+          </w:tcPr>
+          <w:p>
+            <w:pPr>
+              <w:jc w:val="left"/>
+            </w:pPr>
+            <w:r>
+              <w:rPr>
+                <w:rFonts w:ascii="Times New Roman" w:eastAsia="SimSun" w:hAnsi="Times New Roman"/>
+                <w:b w:val="false"/>
+                <w:bCs w:val="false"/>
+                <w:sz w:val="21"/>
+                <w:szCs w:val="21"/>
+              </w:rPr>
+              <w:t xml:space="preserve"/>
+            </w:r>
+          </w:p>
+        </w:tc>
+        <w:tc>
+          <w:tcPr>
+            <w:tcW w:type="dxa" w:w="1400"/>
+            <w:tcMar>
+              <w:top w:type="dxa" w:w="70"/>
+              <w:left w:type="dxa" w:w="110"/>
+              <w:bottom w:type="dxa" w:w="70"/>
+              <w:right w:type="dxa" w:w="110"/>
+            </w:tcMar>
+            <w:vAlign w:val="center"/>
+          </w:tcPr>
+          <w:p>
+            <w:pPr>
+              <w:jc w:val="center"/>
+            </w:pPr>
+            <w:r>
+              <w:rPr>
+                <w:rFonts w:ascii="Times New Roman" w:eastAsia="SimSun" w:hAnsi="Times New Roman"/>
+                <w:b w:val="false"/>
+                <w:bCs w:val="false"/>
+                <w:sz w:val="21"/>
+                <w:szCs w:val="21"/>
+              </w:rPr>
+              <w:t xml:space="preserve">A$1,482.81</w:t>
+            </w:r>
+          </w:p>
+        </w:tc>
+        <w:tc>
+          <w:tcPr>
+            <w:tcW w:type="dxa" w:w="1500"/>
+            <w:tcMar>
+              <w:top w:type="dxa" w:w="70"/>
+              <w:left w:type="dxa" w:w="110"/>
+              <w:bottom w:type="dxa" w:w="70"/>
+              <w:right w:type="dxa" w:w="110"/>
+            </w:tcMar>
+            <w:vAlign w:val="center"/>
+          </w:tcPr>
+          <w:p>
+            <w:pPr>
+              <w:jc w:val="left"/>
+            </w:pPr>
+            <w:r>
+              <w:rPr>
+                <w:rFonts w:ascii="Times New Roman" w:eastAsia="SimSun" w:hAnsi="Times New Roman"/>
+                <w:b w:val="false"/>
+                <w:bCs w:val="false"/>
+                <w:sz w:val="21"/>
+                <w:szCs w:val="21"/>
+              </w:rPr>
+              <w:t xml:space="preserve"/>
+            </w:r>
+          </w:p>
+        </w:tc>
+        <w:tc>
+          <w:tcPr>
+            <w:tcW w:type="dxa" w:w="1400"/>
+            <w:tcMar>
+              <w:top w:type="dxa" w:w="70"/>
+              <w:left w:type="dxa" w:w="110"/>
+              <w:bottom w:type="dxa" w:w="70"/>
+              <w:right w:type="dxa" w:w="110"/>
+            </w:tcMar>
+            <w:vAlign w:val="center"/>
+          </w:tcPr>
+          <w:p>
+            <w:pPr>
+              <w:jc w:val="left"/>
+            </w:pPr>
+            <w:r>
+              <w:rPr>
+                <w:rFonts w:ascii="Times New Roman" w:eastAsia="SimSun" w:hAnsi="Times New Roman"/>
+                <w:b w:val="false"/>
+                <w:bCs w:val="false"/>
+                <w:sz w:val="21"/>
+                <w:szCs w:val="21"/>
+              </w:rPr>
+              <w:t xml:space="preserve"/>
+            </w:r>
+          </w:p>
+        </w:tc>
+        <w:tc>
+          <w:tcPr>
+            <w:tcW w:type="dxa" w:w="1500"/>
+            <w:tcMar>
+              <w:top w:type="dxa" w:w="70"/>
+              <w:left w:type="dxa" w:w="110"/>
+              <w:bottom w:type="dxa" w:w="70"/>
+              <w:right w:type="dxa" w:w="110"/>
+            </w:tcMar>
+            <w:vAlign w:val="center"/>
+          </w:tcPr>
+          <w:p>
+            <w:pPr>
+              <w:jc w:val="center"/>
+            </w:pPr>
+            <w:r>
+              <w:rPr>
+                <w:rFonts w:ascii="Times New Roman" w:eastAsia="SimSun" w:hAnsi="Times New Roman"/>
+                <w:b w:val="false"/>
+                <w:bCs w:val="false"/>
+                <w:sz w:val="21"/>
+                <w:szCs w:val="21"/>
+              </w:rPr>
+              <w:t xml:space="preserve">A$8,593.69</w:t>
+            </w:r>
+          </w:p>
+        </w:tc>
+        <w:tc>
+          <w:tcPr>
+            <w:tcW w:type="dxa" w:w="1126"/>
+            <w:tcMar>
+              <w:top w:type="dxa" w:w="70"/>
+              <w:left w:type="dxa" w:w="110"/>
+              <w:bottom w:type="dxa" w:w="70"/>
+              <w:right w:type="dxa" w:w="110"/>
+            </w:tcMar>
+            <w:vAlign w:val="center"/>
+          </w:tcPr>
+          <w:p>
+            <w:pPr>
+              <w:jc w:val="left"/>
+            </w:pPr>
+            <w:r>
+              <w:rPr>
+                <w:rFonts w:ascii="Times New Roman" w:eastAsia="SimSun" w:hAnsi="Times New Roman"/>
+                <w:b w:val="false"/>
+                <w:bCs w:val="false"/>
+                <w:sz w:val="21"/>
+                <w:szCs w:val="21"/>
+              </w:rPr>
+              <w:t xml:space="preserve"/>
+            </w:r>
+          </w:p>
+        </w:tc>
+      </w:tr>
+      <w:tr>
+        <w:tc>
+          <w:tcPr>
+            <w:tcW w:type="dxa" w:w="600"/>
+            <w:tcMar>
+              <w:top w:type="dxa" w:w="70"/>
+              <w:left w:type="dxa" w:w="110"/>
+              <w:bottom w:type="dxa" w:w="70"/>
+              <w:right w:type="dxa" w:w="110"/>
+            </w:tcMar>
+            <w:vAlign w:val="center"/>
+          </w:tcPr>
+          <w:p>
+            <w:pPr>
+              <w:jc w:val="center"/>
+            </w:pPr>
+            <w:r>
+              <w:rPr>
+                <w:rFonts w:ascii="Times New Roman" w:eastAsia="SimSun" w:hAnsi="Times New Roman"/>
+                <w:b w:val="false"/>
+                <w:bCs w:val="false"/>
+                <w:sz w:val="21"/>
+                <w:szCs w:val="21"/>
+              </w:rPr>
+              <w:t xml:space="preserve">19</w:t>
+            </w:r>
+          </w:p>
+        </w:tc>
+        <w:tc>
+          <w:tcPr>
+            <w:tcW w:type="dxa" w:w="1500"/>
+            <w:tcMar>
+              <w:top w:type="dxa" w:w="70"/>
+              <w:left w:type="dxa" w:w="110"/>
+              <w:bottom w:type="dxa" w:w="70"/>
+              <w:right w:type="dxa" w:w="110"/>
+            </w:tcMar>
+            <w:vAlign w:val="center"/>
+          </w:tcPr>
+          <w:p>
+            <w:pPr>
+              <w:jc w:val="left"/>
+            </w:pPr>
+            <w:r>
+              <w:rPr>
+                <w:rFonts w:ascii="Times New Roman" w:eastAsia="SimSun" w:hAnsi="Times New Roman"/>
+                <w:b w:val="false"/>
+                <w:bCs w:val="false"/>
+                <w:sz w:val="21"/>
+                <w:szCs w:val="21"/>
+              </w:rPr>
+              <w:t xml:space="preserve"/>
+            </w:r>
+          </w:p>
+        </w:tc>
+        <w:tc>
+          <w:tcPr>
+            <w:tcW w:type="dxa" w:w="1400"/>
+            <w:tcMar>
+              <w:top w:type="dxa" w:w="70"/>
+              <w:left w:type="dxa" w:w="110"/>
+              <w:bottom w:type="dxa" w:w="70"/>
+              <w:right w:type="dxa" w:w="110"/>
+            </w:tcMar>
+            <w:vAlign w:val="center"/>
+          </w:tcPr>
+          <w:p>
+            <w:pPr>
+              <w:jc w:val="center"/>
+            </w:pPr>
+            <w:r>
+              <w:rPr>
+                <w:rFonts w:ascii="Times New Roman" w:eastAsia="SimSun" w:hAnsi="Times New Roman"/>
+                <w:b w:val="false"/>
+                <w:bCs w:val="false"/>
+                <w:sz w:val="21"/>
+                <w:szCs w:val="21"/>
+              </w:rPr>
+              <w:t xml:space="preserve">A$1,482.81</w:t>
+            </w:r>
+          </w:p>
+        </w:tc>
+        <w:tc>
+          <w:tcPr>
+            <w:tcW w:type="dxa" w:w="1500"/>
+            <w:tcMar>
+              <w:top w:type="dxa" w:w="70"/>
+              <w:left w:type="dxa" w:w="110"/>
+              <w:bottom w:type="dxa" w:w="70"/>
+              <w:right w:type="dxa" w:w="110"/>
+            </w:tcMar>
+            <w:vAlign w:val="center"/>
+          </w:tcPr>
+          <w:p>
+            <w:pPr>
+              <w:jc w:val="left"/>
+            </w:pPr>
+            <w:r>
+              <w:rPr>
+                <w:rFonts w:ascii="Times New Roman" w:eastAsia="SimSun" w:hAnsi="Times New Roman"/>
+                <w:b w:val="false"/>
+                <w:bCs w:val="false"/>
+                <w:sz w:val="21"/>
+                <w:szCs w:val="21"/>
+              </w:rPr>
+              <w:t xml:space="preserve"/>
+            </w:r>
+          </w:p>
+        </w:tc>
+        <w:tc>
+          <w:tcPr>
+            <w:tcW w:type="dxa" w:w="1400"/>
+            <w:tcMar>
+              <w:top w:type="dxa" w:w="70"/>
+              <w:left w:type="dxa" w:w="110"/>
+              <w:bottom w:type="dxa" w:w="70"/>
+              <w:right w:type="dxa" w:w="110"/>
+            </w:tcMar>
+            <w:vAlign w:val="center"/>
+          </w:tcPr>
+          <w:p>
+            <w:pPr>
+              <w:jc w:val="left"/>
+            </w:pPr>
+            <w:r>
+              <w:rPr>
+                <w:rFonts w:ascii="Times New Roman" w:eastAsia="SimSun" w:hAnsi="Times New Roman"/>
+                <w:b w:val="false"/>
+                <w:bCs w:val="false"/>
+                <w:sz w:val="21"/>
+                <w:szCs w:val="21"/>
+              </w:rPr>
+              <w:t xml:space="preserve"/>
+            </w:r>
+          </w:p>
+        </w:tc>
+        <w:tc>
+          <w:tcPr>
+            <w:tcW w:type="dxa" w:w="1500"/>
+            <w:tcMar>
+              <w:top w:type="dxa" w:w="70"/>
+              <w:left w:type="dxa" w:w="110"/>
+              <w:bottom w:type="dxa" w:w="70"/>
+              <w:right w:type="dxa" w:w="110"/>
+            </w:tcMar>
+            <w:vAlign w:val="center"/>
+          </w:tcPr>
+          <w:p>
+            <w:pPr>
+              <w:jc w:val="center"/>
+            </w:pPr>
+            <w:r>
+              <w:rPr>
+                <w:rFonts w:ascii="Times New Roman" w:eastAsia="SimSun" w:hAnsi="Times New Roman"/>
+                <w:b w:val="false"/>
+                <w:bCs w:val="false"/>
+                <w:sz w:val="21"/>
+                <w:szCs w:val="21"/>
+              </w:rPr>
+              <w:t xml:space="preserve">A$7,196.82</w:t>
+            </w:r>
+          </w:p>
+        </w:tc>
+        <w:tc>
+          <w:tcPr>
+            <w:tcW w:type="dxa" w:w="1126"/>
+            <w:tcMar>
+              <w:top w:type="dxa" w:w="70"/>
+              <w:left w:type="dxa" w:w="110"/>
+              <w:bottom w:type="dxa" w:w="70"/>
+              <w:right w:type="dxa" w:w="110"/>
+            </w:tcMar>
+            <w:vAlign w:val="center"/>
+          </w:tcPr>
+          <w:p>
+            <w:pPr>
+              <w:jc w:val="left"/>
+            </w:pPr>
+            <w:r>
+              <w:rPr>
+                <w:rFonts w:ascii="Times New Roman" w:eastAsia="SimSun" w:hAnsi="Times New Roman"/>
+                <w:b w:val="false"/>
+                <w:bCs w:val="false"/>
+                <w:sz w:val="21"/>
+                <w:szCs w:val="21"/>
+              </w:rPr>
+              <w:t xml:space="preserve"/>
+            </w:r>
+          </w:p>
+        </w:tc>
+      </w:tr>
+      <w:tr>
+        <w:tc>
+          <w:tcPr>
+            <w:tcW w:type="dxa" w:w="600"/>
+            <w:tcMar>
+              <w:top w:type="dxa" w:w="70"/>
+              <w:left w:type="dxa" w:w="110"/>
+              <w:bottom w:type="dxa" w:w="70"/>
+              <w:right w:type="dxa" w:w="110"/>
+            </w:tcMar>
+            <w:vAlign w:val="center"/>
+          </w:tcPr>
+          <w:p>
+            <w:pPr>
+              <w:jc w:val="center"/>
+            </w:pPr>
+            <w:r>
+              <w:rPr>
+                <w:rFonts w:ascii="Times New Roman" w:eastAsia="SimSun" w:hAnsi="Times New Roman"/>
+                <w:b w:val="false"/>
+                <w:bCs w:val="false"/>
+                <w:sz w:val="21"/>
+                <w:szCs w:val="21"/>
+              </w:rPr>
+              <w:t xml:space="preserve">20</w:t>
+            </w:r>
+          </w:p>
+        </w:tc>
+        <w:tc>
+          <w:tcPr>
+            <w:tcW w:type="dxa" w:w="1500"/>
+            <w:tcMar>
+              <w:top w:type="dxa" w:w="70"/>
+              <w:left w:type="dxa" w:w="110"/>
+              <w:bottom w:type="dxa" w:w="70"/>
+              <w:right w:type="dxa" w:w="110"/>
+            </w:tcMar>
+            <w:vAlign w:val="center"/>
+          </w:tcPr>
+          <w:p>
+            <w:pPr>
+              <w:jc w:val="left"/>
+            </w:pPr>
+            <w:r>
+              <w:rPr>
+                <w:rFonts w:ascii="Times New Roman" w:eastAsia="SimSun" w:hAnsi="Times New Roman"/>
+                <w:b w:val="false"/>
+                <w:bCs w:val="false"/>
+                <w:sz w:val="21"/>
+                <w:szCs w:val="21"/>
+              </w:rPr>
+              <w:t xml:space="preserve"/>
+            </w:r>
+          </w:p>
+        </w:tc>
+        <w:tc>
+          <w:tcPr>
+            <w:tcW w:type="dxa" w:w="1400"/>
+            <w:tcMar>
+              <w:top w:type="dxa" w:w="70"/>
+              <w:left w:type="dxa" w:w="110"/>
+              <w:bottom w:type="dxa" w:w="70"/>
+              <w:right w:type="dxa" w:w="110"/>
+            </w:tcMar>
+            <w:vAlign w:val="center"/>
+          </w:tcPr>
+          <w:p>
+            <w:pPr>
+              <w:jc w:val="center"/>
+            </w:pPr>
+            <w:r>
+              <w:rPr>
+                <w:rFonts w:ascii="Times New Roman" w:eastAsia="SimSun" w:hAnsi="Times New Roman"/>
+                <w:b w:val="false"/>
+                <w:bCs w:val="false"/>
+                <w:sz w:val="21"/>
+                <w:szCs w:val="21"/>
+              </w:rPr>
+              <w:t xml:space="preserve">A$1,482.81</w:t>
+            </w:r>
+          </w:p>
+        </w:tc>
+        <w:tc>
+          <w:tcPr>
+            <w:tcW w:type="dxa" w:w="1500"/>
+            <w:tcMar>
+              <w:top w:type="dxa" w:w="70"/>
+              <w:left w:type="dxa" w:w="110"/>
+              <w:bottom w:type="dxa" w:w="70"/>
+              <w:right w:type="dxa" w:w="110"/>
+            </w:tcMar>
+            <w:vAlign w:val="center"/>
+          </w:tcPr>
+          <w:p>
+            <w:pPr>
+              <w:jc w:val="left"/>
+            </w:pPr>
+            <w:r>
+              <w:rPr>
+                <w:rFonts w:ascii="Times New Roman" w:eastAsia="SimSun" w:hAnsi="Times New Roman"/>
+                <w:b w:val="false"/>
+                <w:bCs w:val="false"/>
+                <w:sz w:val="21"/>
+                <w:szCs w:val="21"/>
+              </w:rPr>
+              <w:t xml:space="preserve"/>
+            </w:r>
+          </w:p>
+        </w:tc>
+        <w:tc>
+          <w:tcPr>
+            <w:tcW w:type="dxa" w:w="1400"/>
+            <w:tcMar>
+              <w:top w:type="dxa" w:w="70"/>
+              <w:left w:type="dxa" w:w="110"/>
+              <w:bottom w:type="dxa" w:w="70"/>
+              <w:right w:type="dxa" w:w="110"/>
+            </w:tcMar>
+            <w:vAlign w:val="center"/>
+          </w:tcPr>
+          <w:p>
+            <w:pPr>
+              <w:jc w:val="left"/>
+            </w:pPr>
+            <w:r>
+              <w:rPr>
+                <w:rFonts w:ascii="Times New Roman" w:eastAsia="SimSun" w:hAnsi="Times New Roman"/>
+                <w:b w:val="false"/>
+                <w:bCs w:val="false"/>
+                <w:sz w:val="21"/>
+                <w:szCs w:val="21"/>
+              </w:rPr>
+              <w:t xml:space="preserve"/>
+            </w:r>
+          </w:p>
+        </w:tc>
+        <w:tc>
+          <w:tcPr>
+            <w:tcW w:type="dxa" w:w="1500"/>
+            <w:tcMar>
+              <w:top w:type="dxa" w:w="70"/>
+              <w:left w:type="dxa" w:w="110"/>
+              <w:bottom w:type="dxa" w:w="70"/>
+              <w:right w:type="dxa" w:w="110"/>
+            </w:tcMar>
+            <w:vAlign w:val="center"/>
+          </w:tcPr>
+          <w:p>
+            <w:pPr>
+              <w:jc w:val="center"/>
+            </w:pPr>
+            <w:r>
+              <w:rPr>
+                <w:rFonts w:ascii="Times New Roman" w:eastAsia="SimSun" w:hAnsi="Times New Roman"/>
+                <w:b w:val="false"/>
+                <w:bCs w:val="false"/>
+                <w:sz w:val="21"/>
+                <w:szCs w:val="21"/>
+              </w:rPr>
+              <w:t xml:space="preserve">A$5,785.98</w:t>
+            </w:r>
+          </w:p>
+        </w:tc>
+        <w:tc>
+          <w:tcPr>
+            <w:tcW w:type="dxa" w:w="1126"/>
+            <w:tcMar>
+              <w:top w:type="dxa" w:w="70"/>
+              <w:left w:type="dxa" w:w="110"/>
+              <w:bottom w:type="dxa" w:w="70"/>
+              <w:right w:type="dxa" w:w="110"/>
+            </w:tcMar>
+            <w:vAlign w:val="center"/>
+          </w:tcPr>
+          <w:p>
+            <w:pPr>
+              <w:jc w:val="left"/>
+            </w:pPr>
+            <w:r>
+              <w:rPr>
+                <w:rFonts w:ascii="Times New Roman" w:eastAsia="SimSun" w:hAnsi="Times New Roman"/>
+                <w:b w:val="false"/>
+                <w:bCs w:val="false"/>
+                <w:sz w:val="21"/>
+                <w:szCs w:val="21"/>
+              </w:rPr>
+              <w:t xml:space="preserve"/>
+            </w:r>
+          </w:p>
+        </w:tc>
+      </w:tr>
+      <w:tr>
+        <w:tc>
+          <w:tcPr>
+            <w:tcW w:type="dxa" w:w="600"/>
+            <w:tcMar>
+              <w:top w:type="dxa" w:w="70"/>
+              <w:left w:type="dxa" w:w="110"/>
+              <w:bottom w:type="dxa" w:w="70"/>
+              <w:right w:type="dxa" w:w="110"/>
+            </w:tcMar>
+            <w:vAlign w:val="center"/>
+          </w:tcPr>
+          <w:p>
+            <w:pPr>
+              <w:jc w:val="center"/>
+            </w:pPr>
+            <w:r>
+              <w:rPr>
+                <w:rFonts w:ascii="Times New Roman" w:eastAsia="SimSun" w:hAnsi="Times New Roman"/>
+                <w:b w:val="false"/>
+                <w:bCs w:val="false"/>
+                <w:sz w:val="21"/>
+                <w:szCs w:val="21"/>
+              </w:rPr>
+              <w:t xml:space="preserve">21</w:t>
+            </w:r>
+          </w:p>
+        </w:tc>
+        <w:tc>
+          <w:tcPr>
+            <w:tcW w:type="dxa" w:w="1500"/>
+            <w:tcMar>
+              <w:top w:type="dxa" w:w="70"/>
+              <w:left w:type="dxa" w:w="110"/>
+              <w:bottom w:type="dxa" w:w="70"/>
+              <w:right w:type="dxa" w:w="110"/>
+            </w:tcMar>
+            <w:vAlign w:val="center"/>
+          </w:tcPr>
+          <w:p>
+            <w:pPr>
+              <w:jc w:val="left"/>
+            </w:pPr>
+            <w:r>
+              <w:rPr>
+                <w:rFonts w:ascii="Times New Roman" w:eastAsia="SimSun" w:hAnsi="Times New Roman"/>
+                <w:b w:val="false"/>
+                <w:bCs w:val="false"/>
+                <w:sz w:val="21"/>
+                <w:szCs w:val="21"/>
+              </w:rPr>
+              <w:t xml:space="preserve"/>
+            </w:r>
+          </w:p>
+        </w:tc>
+        <w:tc>
+          <w:tcPr>
+            <w:tcW w:type="dxa" w:w="1400"/>
+            <w:tcMar>
+              <w:top w:type="dxa" w:w="70"/>
+              <w:left w:type="dxa" w:w="110"/>
+              <w:bottom w:type="dxa" w:w="70"/>
+              <w:right w:type="dxa" w:w="110"/>
+            </w:tcMar>
+            <w:vAlign w:val="center"/>
+          </w:tcPr>
+          <w:p>
+            <w:pPr>
+              <w:jc w:val="center"/>
+            </w:pPr>
+            <w:r>
+              <w:rPr>
+                <w:rFonts w:ascii="Times New Roman" w:eastAsia="SimSun" w:hAnsi="Times New Roman"/>
+                <w:b w:val="false"/>
+                <w:bCs w:val="false"/>
+                <w:sz w:val="21"/>
+                <w:szCs w:val="21"/>
+              </w:rPr>
+              <w:t xml:space="preserve">A$1,482.81</w:t>
+            </w:r>
+          </w:p>
+        </w:tc>
+        <w:tc>
+          <w:tcPr>
+            <w:tcW w:type="dxa" w:w="1500"/>
+            <w:tcMar>
+              <w:top w:type="dxa" w:w="70"/>
+              <w:left w:type="dxa" w:w="110"/>
+              <w:bottom w:type="dxa" w:w="70"/>
+              <w:right w:type="dxa" w:w="110"/>
+            </w:tcMar>
+            <w:vAlign w:val="center"/>
+          </w:tcPr>
+          <w:p>
+            <w:pPr>
+              <w:jc w:val="left"/>
+            </w:pPr>
+            <w:r>
+              <w:rPr>
+                <w:rFonts w:ascii="Times New Roman" w:eastAsia="SimSun" w:hAnsi="Times New Roman"/>
+                <w:b w:val="false"/>
+                <w:bCs w:val="false"/>
+                <w:sz w:val="21"/>
+                <w:szCs w:val="21"/>
+              </w:rPr>
+              <w:t xml:space="preserve"/>
+            </w:r>
+          </w:p>
+        </w:tc>
+        <w:tc>
+          <w:tcPr>
+            <w:tcW w:type="dxa" w:w="1400"/>
+            <w:tcMar>
+              <w:top w:type="dxa" w:w="70"/>
+              <w:left w:type="dxa" w:w="110"/>
+              <w:bottom w:type="dxa" w:w="70"/>
+              <w:right w:type="dxa" w:w="110"/>
+            </w:tcMar>
+            <w:vAlign w:val="center"/>
+          </w:tcPr>
+          <w:p>
+            <w:pPr>
+              <w:jc w:val="left"/>
+            </w:pPr>
+            <w:r>
+              <w:rPr>
+                <w:rFonts w:ascii="Times New Roman" w:eastAsia="SimSun" w:hAnsi="Times New Roman"/>
+                <w:b w:val="false"/>
+                <w:bCs w:val="false"/>
+                <w:sz w:val="21"/>
+                <w:szCs w:val="21"/>
+              </w:rPr>
+              <w:t xml:space="preserve"/>
+            </w:r>
+          </w:p>
+        </w:tc>
+        <w:tc>
+          <w:tcPr>
+            <w:tcW w:type="dxa" w:w="1500"/>
+            <w:tcMar>
+              <w:top w:type="dxa" w:w="70"/>
+              <w:left w:type="dxa" w:w="110"/>
+              <w:bottom w:type="dxa" w:w="70"/>
+              <w:right w:type="dxa" w:w="110"/>
+            </w:tcMar>
+            <w:vAlign w:val="center"/>
+          </w:tcPr>
+          <w:p>
+            <w:pPr>
+              <w:jc w:val="center"/>
+            </w:pPr>
+            <w:r>
+              <w:rPr>
+                <w:rFonts w:ascii="Times New Roman" w:eastAsia="SimSun" w:hAnsi="Times New Roman"/>
+                <w:b w:val="false"/>
+                <w:bCs w:val="false"/>
+                <w:sz w:val="21"/>
+                <w:szCs w:val="21"/>
+              </w:rPr>
+              <w:t xml:space="preserve">A$4,361.03</w:t>
+            </w:r>
+          </w:p>
+        </w:tc>
+        <w:tc>
+          <w:tcPr>
+            <w:tcW w:type="dxa" w:w="1126"/>
+            <w:tcMar>
+              <w:top w:type="dxa" w:w="70"/>
+              <w:left w:type="dxa" w:w="110"/>
+              <w:bottom w:type="dxa" w:w="70"/>
+              <w:right w:type="dxa" w:w="110"/>
+            </w:tcMar>
+            <w:vAlign w:val="center"/>
+          </w:tcPr>
+          <w:p>
+            <w:pPr>
+              <w:jc w:val="left"/>
+            </w:pPr>
+            <w:r>
+              <w:rPr>
+                <w:rFonts w:ascii="Times New Roman" w:eastAsia="SimSun" w:hAnsi="Times New Roman"/>
+                <w:b w:val="false"/>
+                <w:bCs w:val="false"/>
+                <w:sz w:val="21"/>
+                <w:szCs w:val="21"/>
+              </w:rPr>
+              <w:t xml:space="preserve"/>
+            </w:r>
+          </w:p>
+        </w:tc>
+      </w:tr>
+      <w:tr>
+        <w:tc>
+          <w:tcPr>
+            <w:tcW w:type="dxa" w:w="600"/>
+            <w:tcMar>
+              <w:top w:type="dxa" w:w="70"/>
+              <w:left w:type="dxa" w:w="110"/>
+              <w:bottom w:type="dxa" w:w="70"/>
+              <w:right w:type="dxa" w:w="110"/>
+            </w:tcMar>
+            <w:vAlign w:val="center"/>
+          </w:tcPr>
+          <w:p>
+            <w:pPr>
+              <w:jc w:val="center"/>
+            </w:pPr>
+            <w:r>
+              <w:rPr>
+                <w:rFonts w:ascii="Times New Roman" w:eastAsia="SimSun" w:hAnsi="Times New Roman"/>
+                <w:b w:val="false"/>
+                <w:bCs w:val="false"/>
+                <w:sz w:val="21"/>
+                <w:szCs w:val="21"/>
+              </w:rPr>
+              <w:t xml:space="preserve">22</w:t>
+            </w:r>
+          </w:p>
+        </w:tc>
+        <w:tc>
+          <w:tcPr>
+            <w:tcW w:type="dxa" w:w="1500"/>
+            <w:tcMar>
+              <w:top w:type="dxa" w:w="70"/>
+              <w:left w:type="dxa" w:w="110"/>
+              <w:bottom w:type="dxa" w:w="70"/>
+              <w:right w:type="dxa" w:w="110"/>
+            </w:tcMar>
+            <w:vAlign w:val="center"/>
+          </w:tcPr>
+          <w:p>
+            <w:pPr>
+              <w:jc w:val="left"/>
+            </w:pPr>
+            <w:r>
+              <w:rPr>
+                <w:rFonts w:ascii="Times New Roman" w:eastAsia="SimSun" w:hAnsi="Times New Roman"/>
+                <w:b w:val="false"/>
+                <w:bCs w:val="false"/>
+                <w:sz w:val="21"/>
+                <w:szCs w:val="21"/>
+              </w:rPr>
+              <w:t xml:space="preserve"/>
+            </w:r>
+          </w:p>
+        </w:tc>
+        <w:tc>
+          <w:tcPr>
+            <w:tcW w:type="dxa" w:w="1400"/>
+            <w:tcMar>
+              <w:top w:type="dxa" w:w="70"/>
+              <w:left w:type="dxa" w:w="110"/>
+              <w:bottom w:type="dxa" w:w="70"/>
+              <w:right w:type="dxa" w:w="110"/>
+            </w:tcMar>
+            <w:vAlign w:val="center"/>
+          </w:tcPr>
+          <w:p>
+            <w:pPr>
+              <w:jc w:val="center"/>
+            </w:pPr>
+            <w:r>
+              <w:rPr>
+                <w:rFonts w:ascii="Times New Roman" w:eastAsia="SimSun" w:hAnsi="Times New Roman"/>
+                <w:b w:val="false"/>
+                <w:bCs w:val="false"/>
+                <w:sz w:val="21"/>
+                <w:szCs w:val="21"/>
+              </w:rPr>
+              <w:t xml:space="preserve">A$1,482.81</w:t>
+            </w:r>
+          </w:p>
+        </w:tc>
+        <w:tc>
+          <w:tcPr>
+            <w:tcW w:type="dxa" w:w="1500"/>
+            <w:tcMar>
+              <w:top w:type="dxa" w:w="70"/>
+              <w:left w:type="dxa" w:w="110"/>
+              <w:bottom w:type="dxa" w:w="70"/>
+              <w:right w:type="dxa" w:w="110"/>
+            </w:tcMar>
+            <w:vAlign w:val="center"/>
+          </w:tcPr>
+          <w:p>
+            <w:pPr>
+              <w:jc w:val="left"/>
+            </w:pPr>
+            <w:r>
+              <w:rPr>
+                <w:rFonts w:ascii="Times New Roman" w:eastAsia="SimSun" w:hAnsi="Times New Roman"/>
+                <w:b w:val="false"/>
+                <w:bCs w:val="false"/>
+                <w:sz w:val="21"/>
+                <w:szCs w:val="21"/>
+              </w:rPr>
+              <w:t xml:space="preserve"/>
+            </w:r>
+          </w:p>
+        </w:tc>
+        <w:tc>
+          <w:tcPr>
+            <w:tcW w:type="dxa" w:w="1400"/>
+            <w:tcMar>
+              <w:top w:type="dxa" w:w="70"/>
+              <w:left w:type="dxa" w:w="110"/>
+              <w:bottom w:type="dxa" w:w="70"/>
+              <w:right w:type="dxa" w:w="110"/>
+            </w:tcMar>
+            <w:vAlign w:val="center"/>
+          </w:tcPr>
+          <w:p>
+            <w:pPr>
+              <w:jc w:val="left"/>
+            </w:pPr>
+            <w:r>
+              <w:rPr>
+                <w:rFonts w:ascii="Times New Roman" w:eastAsia="SimSun" w:hAnsi="Times New Roman"/>
+                <w:b w:val="false"/>
+                <w:bCs w:val="false"/>
+                <w:sz w:val="21"/>
+                <w:szCs w:val="21"/>
+              </w:rPr>
+              <w:t xml:space="preserve"/>
+            </w:r>
+          </w:p>
+        </w:tc>
+        <w:tc>
+          <w:tcPr>
+            <w:tcW w:type="dxa" w:w="1500"/>
+            <w:tcMar>
+              <w:top w:type="dxa" w:w="70"/>
+              <w:left w:type="dxa" w:w="110"/>
+              <w:bottom w:type="dxa" w:w="70"/>
+              <w:right w:type="dxa" w:w="110"/>
+            </w:tcMar>
+            <w:vAlign w:val="center"/>
+          </w:tcPr>
+          <w:p>
+            <w:pPr>
+              <w:jc w:val="center"/>
+            </w:pPr>
+            <w:r>
+              <w:rPr>
+                <w:rFonts w:ascii="Times New Roman" w:eastAsia="SimSun" w:hAnsi="Times New Roman"/>
+                <w:b w:val="false"/>
+                <w:bCs w:val="false"/>
+                <w:sz w:val="21"/>
+                <w:szCs w:val="21"/>
+              </w:rPr>
+              <w:t xml:space="preserve">A$2,921.83</w:t>
+            </w:r>
+          </w:p>
+        </w:tc>
+        <w:tc>
+          <w:tcPr>
+            <w:tcW w:type="dxa" w:w="1126"/>
+            <w:tcMar>
+              <w:top w:type="dxa" w:w="70"/>
+              <w:left w:type="dxa" w:w="110"/>
+              <w:bottom w:type="dxa" w:w="70"/>
+              <w:right w:type="dxa" w:w="110"/>
+            </w:tcMar>
+            <w:vAlign w:val="center"/>
+          </w:tcPr>
+          <w:p>
+            <w:pPr>
+              <w:jc w:val="left"/>
+            </w:pPr>
+            <w:r>
+              <w:rPr>
+                <w:rFonts w:ascii="Times New Roman" w:eastAsia="SimSun" w:hAnsi="Times New Roman"/>
+                <w:b w:val="false"/>
+                <w:bCs w:val="false"/>
+                <w:sz w:val="21"/>
+                <w:szCs w:val="21"/>
+              </w:rPr>
+              <w:t xml:space="preserve"/>
+            </w:r>
+          </w:p>
+        </w:tc>
+      </w:tr>
+      <w:tr>
+        <w:tc>
+          <w:tcPr>
+            <w:tcW w:type="dxa" w:w="600"/>
+            <w:tcMar>
+              <w:top w:type="dxa" w:w="70"/>
+              <w:left w:type="dxa" w:w="110"/>
+              <w:bottom w:type="dxa" w:w="70"/>
+              <w:right w:type="dxa" w:w="110"/>
+            </w:tcMar>
+            <w:vAlign w:val="center"/>
+          </w:tcPr>
+          <w:p>
+            <w:pPr>
+              <w:jc w:val="center"/>
+            </w:pPr>
+            <w:r>
+              <w:rPr>
+                <w:rFonts w:ascii="Times New Roman" w:eastAsia="SimSun" w:hAnsi="Times New Roman"/>
+                <w:b w:val="false"/>
+                <w:bCs w:val="false"/>
+                <w:sz w:val="21"/>
+                <w:szCs w:val="21"/>
+              </w:rPr>
+              <w:t xml:space="preserve">23</w:t>
+            </w:r>
+          </w:p>
+        </w:tc>
+        <w:tc>
+          <w:tcPr>
+            <w:tcW w:type="dxa" w:w="1500"/>
+            <w:tcMar>
+              <w:top w:type="dxa" w:w="70"/>
+              <w:left w:type="dxa" w:w="110"/>
+              <w:bottom w:type="dxa" w:w="70"/>
+              <w:right w:type="dxa" w:w="110"/>
+            </w:tcMar>
+            <w:vAlign w:val="center"/>
+          </w:tcPr>
+          <w:p>
+            <w:pPr>
+              <w:jc w:val="left"/>
+            </w:pPr>
+            <w:r>
+              <w:rPr>
+                <w:rFonts w:ascii="Times New Roman" w:eastAsia="SimSun" w:hAnsi="Times New Roman"/>
+                <w:b w:val="false"/>
+                <w:bCs w:val="false"/>
+                <w:sz w:val="21"/>
+                <w:szCs w:val="21"/>
+              </w:rPr>
+              <w:t xml:space="preserve"/>
+            </w:r>
+          </w:p>
+        </w:tc>
+        <w:tc>
+          <w:tcPr>
+            <w:tcW w:type="dxa" w:w="1400"/>
+            <w:tcMar>
+              <w:top w:type="dxa" w:w="70"/>
+              <w:left w:type="dxa" w:w="110"/>
+              <w:bottom w:type="dxa" w:w="70"/>
+              <w:right w:type="dxa" w:w="110"/>
+            </w:tcMar>
+            <w:vAlign w:val="center"/>
+          </w:tcPr>
+          <w:p>
+            <w:pPr>
+              <w:jc w:val="center"/>
+            </w:pPr>
+            <w:r>
+              <w:rPr>
+                <w:rFonts w:ascii="Times New Roman" w:eastAsia="SimSun" w:hAnsi="Times New Roman"/>
+                <w:b w:val="false"/>
+                <w:bCs w:val="false"/>
+                <w:sz w:val="21"/>
+                <w:szCs w:val="21"/>
+              </w:rPr>
+              <w:t xml:space="preserve">A$1,482.81</w:t>
+            </w:r>
+          </w:p>
+        </w:tc>
+        <w:tc>
+          <w:tcPr>
+            <w:tcW w:type="dxa" w:w="1500"/>
+            <w:tcMar>
+              <w:top w:type="dxa" w:w="70"/>
+              <w:left w:type="dxa" w:w="110"/>
+              <w:bottom w:type="dxa" w:w="70"/>
+              <w:right w:type="dxa" w:w="110"/>
+            </w:tcMar>
+            <w:vAlign w:val="center"/>
+          </w:tcPr>
+          <w:p>
+            <w:pPr>
+              <w:jc w:val="left"/>
+            </w:pPr>
+            <w:r>
+              <w:rPr>
+                <w:rFonts w:ascii="Times New Roman" w:eastAsia="SimSun" w:hAnsi="Times New Roman"/>
+                <w:b w:val="false"/>
+                <w:bCs w:val="false"/>
+                <w:sz w:val="21"/>
+                <w:szCs w:val="21"/>
+              </w:rPr>
+              <w:t xml:space="preserve"/>
+            </w:r>
+          </w:p>
+        </w:tc>
+        <w:tc>
+          <w:tcPr>
+            <w:tcW w:type="dxa" w:w="1400"/>
+            <w:tcMar>
+              <w:top w:type="dxa" w:w="70"/>
+              <w:left w:type="dxa" w:w="110"/>
+              <w:bottom w:type="dxa" w:w="70"/>
+              <w:right w:type="dxa" w:w="110"/>
+            </w:tcMar>
+            <w:vAlign w:val="center"/>
+          </w:tcPr>
+          <w:p>
+            <w:pPr>
+              <w:jc w:val="left"/>
+            </w:pPr>
+            <w:r>
+              <w:rPr>
+                <w:rFonts w:ascii="Times New Roman" w:eastAsia="SimSun" w:hAnsi="Times New Roman"/>
+                <w:b w:val="false"/>
+                <w:bCs w:val="false"/>
+                <w:sz w:val="21"/>
+                <w:szCs w:val="21"/>
+              </w:rPr>
+              <w:t xml:space="preserve"/>
+            </w:r>
+          </w:p>
+        </w:tc>
+        <w:tc>
+          <w:tcPr>
+            <w:tcW w:type="dxa" w:w="1500"/>
+            <w:tcMar>
+              <w:top w:type="dxa" w:w="70"/>
+              <w:left w:type="dxa" w:w="110"/>
+              <w:bottom w:type="dxa" w:w="70"/>
+              <w:right w:type="dxa" w:w="110"/>
+            </w:tcMar>
+            <w:vAlign w:val="center"/>
+          </w:tcPr>
+          <w:p>
+            <w:pPr>
+              <w:jc w:val="center"/>
+            </w:pPr>
+            <w:r>
+              <w:rPr>
+                <w:rFonts w:ascii="Times New Roman" w:eastAsia="SimSun" w:hAnsi="Times New Roman"/>
+                <w:b w:val="false"/>
+                <w:bCs w:val="false"/>
+                <w:sz w:val="21"/>
+                <w:szCs w:val="21"/>
+              </w:rPr>
+              <w:t xml:space="preserve">A$1,468.24</w:t>
+            </w:r>
+          </w:p>
+        </w:tc>
+        <w:tc>
+          <w:tcPr>
+            <w:tcW w:type="dxa" w:w="1126"/>
+            <w:tcMar>
+              <w:top w:type="dxa" w:w="70"/>
+              <w:left w:type="dxa" w:w="110"/>
+              <w:bottom w:type="dxa" w:w="70"/>
+              <w:right w:type="dxa" w:w="110"/>
+            </w:tcMar>
+            <w:vAlign w:val="center"/>
+          </w:tcPr>
+          <w:p>
+            <w:pPr>
+              <w:jc w:val="left"/>
+            </w:pPr>
+            <w:r>
+              <w:rPr>
+                <w:rFonts w:ascii="Times New Roman" w:eastAsia="SimSun" w:hAnsi="Times New Roman"/>
+                <w:b w:val="false"/>
+                <w:bCs w:val="false"/>
+                <w:sz w:val="21"/>
+                <w:szCs w:val="21"/>
+              </w:rPr>
+              <w:t xml:space="preserve"/>
+            </w:r>
+          </w:p>
+        </w:tc>
+      </w:tr>
+      <w:tr>
+        <w:tc>
+          <w:tcPr>
+            <w:tcW w:type="dxa" w:w="600"/>
+            <w:tcMar>
+              <w:top w:type="dxa" w:w="70"/>
+              <w:left w:type="dxa" w:w="110"/>
+              <w:bottom w:type="dxa" w:w="70"/>
+              <w:right w:type="dxa" w:w="110"/>
+            </w:tcMar>
+            <w:vAlign w:val="center"/>
+          </w:tcPr>
+          <w:p>
+            <w:pPr>
+              <w:jc w:val="center"/>
+            </w:pPr>
+            <w:r>
+              <w:rPr>
+                <w:rFonts w:ascii="Times New Roman" w:eastAsia="SimSun" w:hAnsi="Times New Roman"/>
+                <w:b w:val="false"/>
+                <w:bCs w:val="false"/>
+                <w:sz w:val="21"/>
+                <w:szCs w:val="21"/>
+              </w:rPr>
+              <w:t xml:space="preserve">24</w:t>
+            </w:r>
+          </w:p>
+        </w:tc>
+        <w:tc>
+          <w:tcPr>
+            <w:tcW w:type="dxa" w:w="1500"/>
+            <w:tcMar>
+              <w:top w:type="dxa" w:w="70"/>
+              <w:left w:type="dxa" w:w="110"/>
+              <w:bottom w:type="dxa" w:w="70"/>
+              <w:right w:type="dxa" w:w="110"/>
+            </w:tcMar>
+            <w:vAlign w:val="center"/>
+          </w:tcPr>
+          <w:p>
+            <w:pPr>
+              <w:jc w:val="left"/>
+            </w:pPr>
+            <w:r>
+              <w:rPr>
+                <w:rFonts w:ascii="Times New Roman" w:eastAsia="SimSun" w:hAnsi="Times New Roman"/>
+                <w:b w:val="false"/>
+                <w:bCs w:val="false"/>
+                <w:sz w:val="21"/>
+                <w:szCs w:val="21"/>
+              </w:rPr>
+              <w:t xml:space="preserve"/>
+            </w:r>
+          </w:p>
+        </w:tc>
+        <w:tc>
+          <w:tcPr>
+            <w:tcW w:type="dxa" w:w="1400"/>
+            <w:tcMar>
+              <w:top w:type="dxa" w:w="70"/>
+              <w:left w:type="dxa" w:w="110"/>
+              <w:bottom w:type="dxa" w:w="70"/>
+              <w:right w:type="dxa" w:w="110"/>
+            </w:tcMar>
+            <w:vAlign w:val="center"/>
+          </w:tcPr>
+          <w:p>
+            <w:pPr>
+              <w:jc w:val="center"/>
+            </w:pPr>
+            <w:r>
+              <w:rPr>
+                <w:rFonts w:ascii="Times New Roman" w:eastAsia="SimSun" w:hAnsi="Times New Roman"/>
+                <w:b w:val="false"/>
+                <w:bCs w:val="false"/>
+                <w:sz w:val="21"/>
+                <w:szCs w:val="21"/>
+              </w:rPr>
+              <w:t xml:space="preserve">A$1,482.92</w:t>
+            </w:r>
+          </w:p>
+        </w:tc>
+        <w:tc>
+          <w:tcPr>
+            <w:tcW w:type="dxa" w:w="1500"/>
+            <w:tcMar>
+              <w:top w:type="dxa" w:w="70"/>
+              <w:left w:type="dxa" w:w="110"/>
+              <w:bottom w:type="dxa" w:w="70"/>
+              <w:right w:type="dxa" w:w="110"/>
+            </w:tcMar>
+            <w:vAlign w:val="center"/>
+          </w:tcPr>
+          <w:p>
+            <w:pPr>
+              <w:jc w:val="left"/>
+            </w:pPr>
+            <w:r>
+              <w:rPr>
+                <w:rFonts w:ascii="Times New Roman" w:eastAsia="SimSun" w:hAnsi="Times New Roman"/>
+                <w:b w:val="false"/>
+                <w:bCs w:val="false"/>
+                <w:sz w:val="21"/>
+                <w:szCs w:val="21"/>
+              </w:rPr>
+              <w:t xml:space="preserve"/>
+            </w:r>
+          </w:p>
+        </w:tc>
+        <w:tc>
+          <w:tcPr>
+            <w:tcW w:type="dxa" w:w="1400"/>
+            <w:tcMar>
+              <w:top w:type="dxa" w:w="70"/>
+              <w:left w:type="dxa" w:w="110"/>
+              <w:bottom w:type="dxa" w:w="70"/>
+              <w:right w:type="dxa" w:w="110"/>
+            </w:tcMar>
+            <w:vAlign w:val="center"/>
+          </w:tcPr>
+          <w:p>
+            <w:pPr>
+              <w:jc w:val="left"/>
+            </w:pPr>
+            <w:r>
+              <w:rPr>
+                <w:rFonts w:ascii="Times New Roman" w:eastAsia="SimSun" w:hAnsi="Times New Roman"/>
+                <w:b w:val="false"/>
+                <w:bCs w:val="false"/>
+                <w:sz w:val="21"/>
+                <w:szCs w:val="21"/>
+              </w:rPr>
+              <w:t xml:space="preserve"/>
+            </w:r>
+          </w:p>
+        </w:tc>
+        <w:tc>
+          <w:tcPr>
+            <w:tcW w:type="dxa" w:w="1500"/>
+            <w:tcMar>
+              <w:top w:type="dxa" w:w="70"/>
+              <w:left w:type="dxa" w:w="110"/>
+              <w:bottom w:type="dxa" w:w="70"/>
+              <w:right w:type="dxa" w:w="110"/>
+            </w:tcMar>
+            <w:vAlign w:val="center"/>
+          </w:tcPr>
+          <w:p>
+            <w:pPr>
+              <w:jc w:val="center"/>
+            </w:pPr>
+            <w:r>
+              <w:rPr>
+                <w:rFonts w:ascii="Times New Roman" w:eastAsia="SimSun" w:hAnsi="Times New Roman"/>
+                <w:b w:val="false"/>
+                <w:bCs w:val="false"/>
+                <w:sz w:val="21"/>
+                <w:szCs w:val="21"/>
+              </w:rPr>
+              <w:t xml:space="preserve">A$0.00</w:t>
             </w:r>
           </w:p>
         </w:tc>
@@ -5928,7 +8271,7 @@
           <w:sz w:val="18"/>
           <w:szCs w:val="18"/>
         </w:rPr>
-        <w:t xml:space="preserve">Note: the A$500 holding deposit row reflects the online deposit and is credited toward the Purchase Price. Add rows as needed if there are more installments. Each payment takes effect as a record only when confirmed by the Seller’s signature or written receipt. 注:"订金"行为网站支付的500澳元订金,抵扣总价款;期数较多时请自行增加行数;每期还款经卖方签字或出具书面收据确认后方构成有效记录。</w:t>
+        <w:t xml:space="preserve">Note: the A$500.00 holding deposit and the down payment are credited toward the Purchase Price; installments are calculated at 12% p.a. on the reducing balance, with the final installment absorbing rounding. Fill in the due dates from the agreed start date. Each payment takes effect as a record only when confirmed by the Seller’s signature or written receipt. 注:订金500.00澳元与首付款均抵扣总价款;分期款按年利率12%余额递减计算,末期含尾差;请按约定起始日填写各期应付日期;每期还款经卖方签字或出具书面收据确认后方构成有效记录。</w:t>
       </w:r>
     </w:p>
     <w:sectPr>

</xml_diff>

<commit_message>
Add monthly insurance and rego charge to Panamera contract
Insurance and rego are now paid monthly on top of the finance
installment instead of being absorbed in the price: A$2,400/yr
comprehensive cover (RAC-benchmarked) plus A$1,200/yr rego incl. CTP
= A$300/month, trued up against actual premiums at each renewal.
Clause 3.8 rewritten accordingly with a monthly payment breakdown
table (A$1,482.81 + A$300.00 = A$1,782.81; final month A$1,782.92),
and Schedule A amounts now show the combined monthly total.

Co-Authored-By: Claude Fable 5 <noreply@anthropic.com>
Claude-Session: https://claude.ai/code/session_01VvhD1vGqwTgrN3Mmhhvja8
</commit_message>
<xml_diff>
--- a/contracts/vehicle-sale-repayment-contract-2012-porsche-panamera.docx
+++ b/contracts/vehicle-sale-repayment-contract-2012-porsche-panamera.docx
@@ -1624,7 +1624,7 @@
           <w:sz w:val="21"/>
           <w:szCs w:val="21"/>
         </w:rPr>
-        <w:t xml:space="preserve">The total purchase price of the Vehicle is A$45,000.00 (forty-five thousand Australian dollars) (the "Purchase Price"), inclusive of the items listed in Section 2 and the insurance and registration described in Section 3.8.</w:t>
+        <w:t xml:space="preserve">The total purchase price of the Vehicle is A$45,000.00 (forty-five thousand Australian dollars) (the "Purchase Price"), inclusive of the items listed in Section 2. Comprehensive insurance and registration (rego) are charged in addition, monthly, under Section 3.8.</w:t>
       </w:r>
     </w:p>
     <w:p>
@@ -1638,7 +1638,7 @@
           <w:sz w:val="21"/>
           <w:szCs w:val="21"/>
         </w:rPr>
-        <w:t xml:space="preserve">本车辆总价款为45,000.00澳元(大写:肆万伍仟澳元整)(以下简称"总价款"),包含第2条所列配置及第3.8条所述保险与注册费。</w:t>
+        <w:t xml:space="preserve">本车辆总价款为45,000.00澳元(大写:肆万伍仟澳元整)(以下简称"总价款"),包含第2条所列配置。商业全险与注册费(rego)为额外费用,按第3.8条按月支付。</w:t>
       </w:r>
     </w:p>
     <w:p>
@@ -1700,7 +1700,7 @@
           <w:sz w:val="21"/>
           <w:szCs w:val="21"/>
         </w:rPr>
-        <w:t xml:space="preserve">The remaining balance of A$31,500.00 shall be paid in 24 monthly installments over two (2) years: 23 installments of A$1,482.81 each and a final installment of A$1,482.92, due on the ______ day of each month, starting on ______________ and ending on ______________. The installments total A$35,587.55, including total interest of A$4,087.55 (amortization schedule in Schedule A).</w:t>
+        <w:t xml:space="preserve">The remaining balance of A$31,500.00 shall be paid in 24 monthly installments over two (2) years: 23 installments of A$1,482.81 each and a final installment of A$1,482.92, due on the ______ day of each month, starting on ______________ and ending on ______________. The installments total A$35,587.55, including total interest of A$4,087.55 (amortization schedule in Schedule A). Together with the monthly insurance-and-rego charge of A$300.00 under Section 3.8, the total amount payable each month is A$1,782.81 (months 1–23) and A$1,782.92 (final month).</w:t>
       </w:r>
     </w:p>
     <w:p>
@@ -1714,7 +1714,7 @@
           <w:sz w:val="21"/>
           <w:szCs w:val="21"/>
         </w:rPr>
-        <w:t xml:space="preserve">剩余款项31,500.00澳元由买方分24期(2年)按月支付:前23期每期1,482.81澳元,末期1,482.92澳元,于每月______日到期,自______年____月____日起至______年____月____日止。分期款项合计35,587.55澳元,其中利息合计4,087.55澳元(摊还明细见附表A)。</w:t>
+        <w:t xml:space="preserve">剩余款项31,500.00澳元由买方分24期(2年)按月支付:前23期每期1,482.81澳元,末期1,482.92澳元,于每月______日到期,自______年____月____日起至______年____月____日止。分期款项合计35,587.55澳元,其中利息合计4,087.55澳元(摊还明细见附表A)。加上第3.8条保险及注册费月摊300.00澳元,每月合计支付1,782.81澳元(第1–23期),末期合计1,782.92澳元。</w:t>
       </w:r>
     </w:p>
     <w:p>
@@ -1882,15 +1882,15 @@
           <w:sz w:val="21"/>
           <w:szCs w:val="21"/>
         </w:rPr>
-        <w:t xml:space="preserve">3.8 Insurance and registration included 包含保险与注册费. </w:t>
-      </w:r>
-      <w:r>
-        <w:rPr>
-          <w:rFonts w:ascii="Times New Roman" w:eastAsia="SimSun" w:hAnsi="Times New Roman"/>
-          <w:sz w:val="21"/>
-          <w:szCs w:val="21"/>
-        </w:rPr>
-        <w:t xml:space="preserve">The Purchase Price includes, for the repayment period set out in Section 3.3: (a) comprehensive insurance for the Vehicle, with the premium benchmarked against RAC’s quoted price for comparable cover (or an RAC policy); and (b) vehicle registration (rego) renewal, including CTP. The Seller shall arrange or bear these costs, and the policy and registration documents shall record the parties’ interests where applicable.</w:t>
+        <w:t xml:space="preserve">3.8 Monthly insurance and registration charge 保险与注册费月摊. </w:t>
+      </w:r>
+      <w:r>
+        <w:rPr>
+          <w:rFonts w:ascii="Times New Roman" w:eastAsia="SimSun" w:hAnsi="Times New Roman"/>
+          <w:sz w:val="21"/>
+          <w:szCs w:val="21"/>
+        </w:rPr>
+        <w:t xml:space="preserve">In addition to the installments in Section 3.3, the Buyer shall pay the Seller a monthly insurance-and-registration charge of A$300.00, being one-twelfth of: (a) the annual comprehensive insurance premium for the Vehicle, taken as A$2,400.00 per year, benchmarked against RAC’s quoted price for comparable cover (or an RAC policy); and (b) the annual vehicle registration (rego, including CTP), taken as A$1,200.00 per year. During the repayment period the Seller shall arrange and keep the insurance and registration current and provide copies of the policy, renewal notices and receipts to the Buyer. At each renewal the charge shall be adjusted to the actual premium and rego amounts, and any difference shall be refunded or topped up accordingly.</w:t>
       </w:r>
     </w:p>
     <w:p>
@@ -1904,8 +1904,327 @@
           <w:sz w:val="21"/>
           <w:szCs w:val="21"/>
         </w:rPr>
-        <w:t xml:space="preserve">总价款包含第3.3条所述还款期间内的:(a)本车辆商业全险,保费参考RAC同等保障的报价(或直接投保RAC保单);(b)车辆注册费(rego,含强制三者险CTP)的续费。上述费用由卖方负责办理或承担;如适用,保单及注册文件应载明双方权益。</w:t>
-      </w:r>
+        <w:t xml:space="preserve">除第3.3条分期款项外,买方每月另向卖方支付保险及注册费分摊300.00澳元,即以下两项年费的十二分之一:(a)本车辆商业全险年保费,暂按2,400.00澳元/年计,以RAC同等保障的报价为基准(或直接投保RAC保单);(b)车辆注册费(rego,含强制三者险CTP),暂按1,200.00澳元/年计。还款期间由卖方负责办理并维持保险与注册的有效性,并向买方提供保单、续费通知及缴费凭证副本;每次续保/续费时按实际金额调整该分摊额,多退少补。</w:t>
+      </w:r>
+    </w:p>
+    <w:p>
+      <w:pPr>
+        <w:spacing w:after="80" w:before="60"/>
+      </w:pPr>
+      <w:r>
+        <w:rPr>
+          <w:rFonts w:ascii="Times New Roman" w:eastAsia="SimSun" w:hAnsi="Times New Roman"/>
+          <w:b/>
+          <w:bCs/>
+          <w:sz w:val="21"/>
+          <w:szCs w:val="21"/>
+        </w:rPr>
+        <w:t xml:space="preserve">Monthly payment breakdown 每月付款构成:</w:t>
+      </w:r>
+    </w:p>
+    <w:tbl>
+      <w:tblPr>
+        <w:tblW w:type="dxa" w:w="9026"/>
+        <w:tblBorders>
+          <w:top w:val="single" w:color="auto" w:sz="4"/>
+          <w:left w:val="single" w:color="auto" w:sz="4"/>
+          <w:bottom w:val="single" w:color="auto" w:sz="4"/>
+          <w:right w:val="single" w:color="auto" w:sz="4"/>
+          <w:insideH w:val="single" w:color="auto" w:sz="4"/>
+          <w:insideV w:val="single" w:color="auto" w:sz="4"/>
+        </w:tblBorders>
+      </w:tblPr>
+      <w:tblGrid>
+        <w:gridCol w:w="6326"/>
+        <w:gridCol w:w="2700"/>
+      </w:tblGrid>
+      <w:tr>
+        <w:tc>
+          <w:tcPr>
+            <w:tcW w:type="dxa" w:w="6326"/>
+            <w:tcMar>
+              <w:top w:type="dxa" w:w="70"/>
+              <w:left w:type="dxa" w:w="110"/>
+              <w:bottom w:type="dxa" w:w="70"/>
+              <w:right w:type="dxa" w:w="110"/>
+            </w:tcMar>
+            <w:vAlign w:val="center"/>
+          </w:tcPr>
+          <w:p>
+            <w:pPr>
+              <w:jc w:val="left"/>
+            </w:pPr>
+            <w:r>
+              <w:rPr>
+                <w:rFonts w:ascii="Times New Roman" w:eastAsia="SimSun" w:hAnsi="Times New Roman"/>
+                <w:b w:val="false"/>
+                <w:bCs w:val="false"/>
+                <w:sz w:val="21"/>
+                <w:szCs w:val="21"/>
+              </w:rPr>
+              <w:t xml:space="preserve">Finance installment 分期月供(installments 1–23 期)</w:t>
+            </w:r>
+          </w:p>
+        </w:tc>
+        <w:tc>
+          <w:tcPr>
+            <w:tcW w:type="dxa" w:w="2700"/>
+            <w:tcMar>
+              <w:top w:type="dxa" w:w="70"/>
+              <w:left w:type="dxa" w:w="110"/>
+              <w:bottom w:type="dxa" w:w="70"/>
+              <w:right w:type="dxa" w:w="110"/>
+            </w:tcMar>
+            <w:vAlign w:val="center"/>
+          </w:tcPr>
+          <w:p>
+            <w:pPr>
+              <w:jc w:val="center"/>
+            </w:pPr>
+            <w:r>
+              <w:rPr>
+                <w:rFonts w:ascii="Times New Roman" w:eastAsia="SimSun" w:hAnsi="Times New Roman"/>
+                <w:b w:val="false"/>
+                <w:bCs w:val="false"/>
+                <w:sz w:val="21"/>
+                <w:szCs w:val="21"/>
+              </w:rPr>
+              <w:t xml:space="preserve">A$1,482.81</w:t>
+            </w:r>
+          </w:p>
+        </w:tc>
+      </w:tr>
+      <w:tr>
+        <w:tc>
+          <w:tcPr>
+            <w:tcW w:type="dxa" w:w="6326"/>
+            <w:tcMar>
+              <w:top w:type="dxa" w:w="70"/>
+              <w:left w:type="dxa" w:w="110"/>
+              <w:bottom w:type="dxa" w:w="70"/>
+              <w:right w:type="dxa" w:w="110"/>
+            </w:tcMar>
+            <w:vAlign w:val="center"/>
+          </w:tcPr>
+          <w:p>
+            <w:pPr>
+              <w:jc w:val="left"/>
+            </w:pPr>
+            <w:r>
+              <w:rPr>
+                <w:rFonts w:ascii="Times New Roman" w:eastAsia="SimSun" w:hAnsi="Times New Roman"/>
+                <w:b w:val="false"/>
+                <w:bCs w:val="false"/>
+                <w:sz w:val="21"/>
+                <w:szCs w:val="21"/>
+              </w:rPr>
+              <w:t xml:space="preserve">Comprehensive insurance 全险月摊(A$2,400.00/year 年 ÷ 12)</w:t>
+            </w:r>
+          </w:p>
+        </w:tc>
+        <w:tc>
+          <w:tcPr>
+            <w:tcW w:type="dxa" w:w="2700"/>
+            <w:tcMar>
+              <w:top w:type="dxa" w:w="70"/>
+              <w:left w:type="dxa" w:w="110"/>
+              <w:bottom w:type="dxa" w:w="70"/>
+              <w:right w:type="dxa" w:w="110"/>
+            </w:tcMar>
+            <w:vAlign w:val="center"/>
+          </w:tcPr>
+          <w:p>
+            <w:pPr>
+              <w:jc w:val="center"/>
+            </w:pPr>
+            <w:r>
+              <w:rPr>
+                <w:rFonts w:ascii="Times New Roman" w:eastAsia="SimSun" w:hAnsi="Times New Roman"/>
+                <w:b w:val="false"/>
+                <w:bCs w:val="false"/>
+                <w:sz w:val="21"/>
+                <w:szCs w:val="21"/>
+              </w:rPr>
+              <w:t xml:space="preserve">A$200.00</w:t>
+            </w:r>
+          </w:p>
+        </w:tc>
+      </w:tr>
+      <w:tr>
+        <w:tc>
+          <w:tcPr>
+            <w:tcW w:type="dxa" w:w="6326"/>
+            <w:tcMar>
+              <w:top w:type="dxa" w:w="70"/>
+              <w:left w:type="dxa" w:w="110"/>
+              <w:bottom w:type="dxa" w:w="70"/>
+              <w:right w:type="dxa" w:w="110"/>
+            </w:tcMar>
+            <w:vAlign w:val="center"/>
+          </w:tcPr>
+          <w:p>
+            <w:pPr>
+              <w:jc w:val="left"/>
+            </w:pPr>
+            <w:r>
+              <w:rPr>
+                <w:rFonts w:ascii="Times New Roman" w:eastAsia="SimSun" w:hAnsi="Times New Roman"/>
+                <w:b w:val="false"/>
+                <w:bCs w:val="false"/>
+                <w:sz w:val="21"/>
+                <w:szCs w:val="21"/>
+              </w:rPr>
+              <w:t xml:space="preserve">Registration (rego incl. CTP) 注册费月摊(A$1,200.00/year 年 ÷ 12)</w:t>
+            </w:r>
+          </w:p>
+        </w:tc>
+        <w:tc>
+          <w:tcPr>
+            <w:tcW w:type="dxa" w:w="2700"/>
+            <w:tcMar>
+              <w:top w:type="dxa" w:w="70"/>
+              <w:left w:type="dxa" w:w="110"/>
+              <w:bottom w:type="dxa" w:w="70"/>
+              <w:right w:type="dxa" w:w="110"/>
+            </w:tcMar>
+            <w:vAlign w:val="center"/>
+          </w:tcPr>
+          <w:p>
+            <w:pPr>
+              <w:jc w:val="center"/>
+            </w:pPr>
+            <w:r>
+              <w:rPr>
+                <w:rFonts w:ascii="Times New Roman" w:eastAsia="SimSun" w:hAnsi="Times New Roman"/>
+                <w:b w:val="false"/>
+                <w:bCs w:val="false"/>
+                <w:sz w:val="21"/>
+                <w:szCs w:val="21"/>
+              </w:rPr>
+              <w:t xml:space="preserve">A$100.00</w:t>
+            </w:r>
+          </w:p>
+        </w:tc>
+      </w:tr>
+      <w:tr>
+        <w:tc>
+          <w:tcPr>
+            <w:tcW w:type="dxa" w:w="6326"/>
+            <w:shd w:fill="F2F2F2" w:val="clear"/>
+            <w:tcMar>
+              <w:top w:type="dxa" w:w="70"/>
+              <w:left w:type="dxa" w:w="110"/>
+              <w:bottom w:type="dxa" w:w="70"/>
+              <w:right w:type="dxa" w:w="110"/>
+            </w:tcMar>
+            <w:vAlign w:val="center"/>
+          </w:tcPr>
+          <w:p>
+            <w:pPr>
+              <w:jc w:val="left"/>
+            </w:pPr>
+            <w:r>
+              <w:rPr>
+                <w:rFonts w:ascii="Times New Roman" w:eastAsia="SimSun" w:hAnsi="Times New Roman"/>
+                <w:b/>
+                <w:bCs/>
+                <w:sz w:val="21"/>
+                <w:szCs w:val="21"/>
+              </w:rPr>
+              <w:t xml:space="preserve">Total monthly payment 每月合计(months 1–23 期)</w:t>
+            </w:r>
+          </w:p>
+        </w:tc>
+        <w:tc>
+          <w:tcPr>
+            <w:tcW w:type="dxa" w:w="2700"/>
+            <w:shd w:fill="F2F2F2" w:val="clear"/>
+            <w:tcMar>
+              <w:top w:type="dxa" w:w="70"/>
+              <w:left w:type="dxa" w:w="110"/>
+              <w:bottom w:type="dxa" w:w="70"/>
+              <w:right w:type="dxa" w:w="110"/>
+            </w:tcMar>
+            <w:vAlign w:val="center"/>
+          </w:tcPr>
+          <w:p>
+            <w:pPr>
+              <w:jc w:val="center"/>
+            </w:pPr>
+            <w:r>
+              <w:rPr>
+                <w:rFonts w:ascii="Times New Roman" w:eastAsia="SimSun" w:hAnsi="Times New Roman"/>
+                <w:b/>
+                <w:bCs/>
+                <w:sz w:val="21"/>
+                <w:szCs w:val="21"/>
+              </w:rPr>
+              <w:t xml:space="preserve">A$1,782.81</w:t>
+            </w:r>
+          </w:p>
+        </w:tc>
+      </w:tr>
+      <w:tr>
+        <w:tc>
+          <w:tcPr>
+            <w:tcW w:type="dxa" w:w="6326"/>
+            <w:tcMar>
+              <w:top w:type="dxa" w:w="70"/>
+              <w:left w:type="dxa" w:w="110"/>
+              <w:bottom w:type="dxa" w:w="70"/>
+              <w:right w:type="dxa" w:w="110"/>
+            </w:tcMar>
+            <w:vAlign w:val="center"/>
+          </w:tcPr>
+          <w:p>
+            <w:pPr>
+              <w:jc w:val="left"/>
+            </w:pPr>
+            <w:r>
+              <w:rPr>
+                <w:rFonts w:ascii="Times New Roman" w:eastAsia="SimSun" w:hAnsi="Times New Roman"/>
+                <w:b w:val="false"/>
+                <w:bCs w:val="false"/>
+                <w:sz w:val="21"/>
+                <w:szCs w:val="21"/>
+              </w:rPr>
+              <w:t xml:space="preserve">Final month 末期合计(A$1,482.92 + A$300.00)</w:t>
+            </w:r>
+          </w:p>
+        </w:tc>
+        <w:tc>
+          <w:tcPr>
+            <w:tcW w:type="dxa" w:w="2700"/>
+            <w:tcMar>
+              <w:top w:type="dxa" w:w="70"/>
+              <w:left w:type="dxa" w:w="110"/>
+              <w:bottom w:type="dxa" w:w="70"/>
+              <w:right w:type="dxa" w:w="110"/>
+            </w:tcMar>
+            <w:vAlign w:val="center"/>
+          </w:tcPr>
+          <w:p>
+            <w:pPr>
+              <w:jc w:val="center"/>
+            </w:pPr>
+            <w:r>
+              <w:rPr>
+                <w:rFonts w:ascii="Times New Roman" w:eastAsia="SimSun" w:hAnsi="Times New Roman"/>
+                <w:b w:val="false"/>
+                <w:bCs w:val="false"/>
+                <w:sz w:val="21"/>
+                <w:szCs w:val="21"/>
+              </w:rPr>
+              <w:t xml:space="preserve">A$1,782.92</w:t>
+            </w:r>
+          </w:p>
+        </w:tc>
+      </w:tr>
+    </w:tbl>
+    <w:p>
+      <w:pPr>
+        <w:spacing w:after="100"/>
+      </w:pPr>
     </w:p>
     <w:p>
       <w:pPr>
@@ -2372,7 +2691,7 @@
           <w:sz w:val="21"/>
           <w:szCs w:val="21"/>
         </w:rPr>
-        <w:t xml:space="preserve">From the date of delivery, the Buyer is responsible for taxes, inspections, fuel, maintenance, parking, tolls, fines and all other costs of keeping and using the Vehicle, except the comprehensive insurance and registration (rego) included in the Purchase Price under Section 3.8.</w:t>
+        <w:t xml:space="preserve">From the date of delivery, the Buyer is responsible for taxes, inspections, fuel, maintenance, parking, tolls, fines and all other costs of keeping and using the Vehicle. Comprehensive insurance and registration (rego) are arranged by the Seller and paid by the Buyer through the monthly charge under Section 3.8.</w:t>
       </w:r>
     </w:p>
     <w:p>
@@ -2386,7 +2705,7 @@
           <w:sz w:val="21"/>
           <w:szCs w:val="21"/>
         </w:rPr>
-        <w:t xml:space="preserve">自交付之日起,除第3.8条已包含在总价款中的商业全险及注册费(rego)外,本车辆的税费、检验、燃油、保养维修、停车、通行费、罚款及其他持有和使用费用均由买方承担。</w:t>
+        <w:t xml:space="preserve">自交付之日起,本车辆的税费、检验、燃油、保养维修、停车、通行费、罚款及其他持有和使用费用均由买方承担;商业全险及注册费(rego)由卖方负责办理,买方按第3.8条以每月分摊方式支付。</w:t>
       </w:r>
     </w:p>
     <w:p>
@@ -3059,15 +3378,30 @@
     </w:p>
     <w:p>
       <w:pPr>
+        <w:spacing w:after="60"/>
+      </w:pPr>
+      <w:r>
+        <w:rPr>
+          <w:rFonts w:ascii="Times New Roman" w:eastAsia="SimSun" w:hAnsi="Times New Roman"/>
+          <w:sz w:val="21"/>
+          <w:szCs w:val="21"/>
+        </w:rPr>
+        <w:t xml:space="preserve">Financed balance 分期本金:A$31,500.00 · 24 monthly installments 期 · 12% p.a. 年利率(reducing balance 余额递减)</w:t>
+      </w:r>
+    </w:p>
+    <w:p>
+      <w:pPr>
         <w:spacing w:after="160"/>
       </w:pPr>
       <w:r>
         <w:rPr>
           <w:rFonts w:ascii="Times New Roman" w:eastAsia="SimSun" w:hAnsi="Times New Roman"/>
-          <w:sz w:val="21"/>
-          <w:szCs w:val="21"/>
-        </w:rPr>
-        <w:t xml:space="preserve">Financed balance 分期本金:A$31,500.00 · 24 monthly installments 期 · 12% p.a. 年利率(reducing balance 余额递减)</w:t>
+          <w:b/>
+          <w:bCs/>
+          <w:sz w:val="21"/>
+          <w:szCs w:val="21"/>
+        </w:rPr>
+        <w:t xml:space="preserve">Monthly total 每月合计:A$1,482.81 + insurance &amp; rego 保险及注册费月摊 A$300.00 = A$1,782.81(final month 末期 A$1,782.92)</w:t>
       </w:r>
     </w:p>
     <w:tbl>
@@ -3752,7 +4086,7 @@
                 <w:sz w:val="21"/>
                 <w:szCs w:val="21"/>
               </w:rPr>
-              <w:t xml:space="preserve">A$1,482.81</w:t>
+              <w:t xml:space="preserve">A$1,782.81</w:t>
             </w:r>
           </w:p>
         </w:tc>
@@ -3943,7 +4277,7 @@
                 <w:sz w:val="21"/>
                 <w:szCs w:val="21"/>
               </w:rPr>
-              <w:t xml:space="preserve">A$1,482.81</w:t>
+              <w:t xml:space="preserve">A$1,782.81</w:t>
             </w:r>
           </w:p>
         </w:tc>
@@ -4134,7 +4468,7 @@
                 <w:sz w:val="21"/>
                 <w:szCs w:val="21"/>
               </w:rPr>
-              <w:t xml:space="preserve">A$1,482.81</w:t>
+              <w:t xml:space="preserve">A$1,782.81</w:t>
             </w:r>
           </w:p>
         </w:tc>
@@ -4325,7 +4659,7 @@
                 <w:sz w:val="21"/>
                 <w:szCs w:val="21"/>
               </w:rPr>
-              <w:t xml:space="preserve">A$1,482.81</w:t>
+              <w:t xml:space="preserve">A$1,782.81</w:t>
             </w:r>
           </w:p>
         </w:tc>
@@ -4516,7 +4850,7 @@
                 <w:sz w:val="21"/>
                 <w:szCs w:val="21"/>
               </w:rPr>
-              <w:t xml:space="preserve">A$1,482.81</w:t>
+              <w:t xml:space="preserve">A$1,782.81</w:t>
             </w:r>
           </w:p>
         </w:tc>
@@ -4707,7 +5041,7 @@
                 <w:sz w:val="21"/>
                 <w:szCs w:val="21"/>
               </w:rPr>
-              <w:t xml:space="preserve">A$1,482.81</w:t>
+              <w:t xml:space="preserve">A$1,782.81</w:t>
             </w:r>
           </w:p>
         </w:tc>
@@ -4898,7 +5232,7 @@
                 <w:sz w:val="21"/>
                 <w:szCs w:val="21"/>
               </w:rPr>
-              <w:t xml:space="preserve">A$1,482.81</w:t>
+              <w:t xml:space="preserve">A$1,782.81</w:t>
             </w:r>
           </w:p>
         </w:tc>
@@ -5089,7 +5423,7 @@
                 <w:sz w:val="21"/>
                 <w:szCs w:val="21"/>
               </w:rPr>
-              <w:t xml:space="preserve">A$1,482.81</w:t>
+              <w:t xml:space="preserve">A$1,782.81</w:t>
             </w:r>
           </w:p>
         </w:tc>
@@ -5280,7 +5614,7 @@
                 <w:sz w:val="21"/>
                 <w:szCs w:val="21"/>
               </w:rPr>
-              <w:t xml:space="preserve">A$1,482.81</w:t>
+              <w:t xml:space="preserve">A$1,782.81</w:t>
             </w:r>
           </w:p>
         </w:tc>
@@ -5471,7 +5805,7 @@
                 <w:sz w:val="21"/>
                 <w:szCs w:val="21"/>
               </w:rPr>
-              <w:t xml:space="preserve">A$1,482.81</w:t>
+              <w:t xml:space="preserve">A$1,782.81</w:t>
             </w:r>
           </w:p>
         </w:tc>
@@ -5662,7 +5996,7 @@
                 <w:sz w:val="21"/>
                 <w:szCs w:val="21"/>
               </w:rPr>
-              <w:t xml:space="preserve">A$1,482.81</w:t>
+              <w:t xml:space="preserve">A$1,782.81</w:t>
             </w:r>
           </w:p>
         </w:tc>
@@ -5853,7 +6187,7 @@
                 <w:sz w:val="21"/>
                 <w:szCs w:val="21"/>
               </w:rPr>
-              <w:t xml:space="preserve">A$1,482.81</w:t>
+              <w:t xml:space="preserve">A$1,782.81</w:t>
             </w:r>
           </w:p>
         </w:tc>
@@ -6044,7 +6378,7 @@
                 <w:sz w:val="21"/>
                 <w:szCs w:val="21"/>
               </w:rPr>
-              <w:t xml:space="preserve">A$1,482.81</w:t>
+              <w:t xml:space="preserve">A$1,782.81</w:t>
             </w:r>
           </w:p>
         </w:tc>
@@ -6235,7 +6569,7 @@
                 <w:sz w:val="21"/>
                 <w:szCs w:val="21"/>
               </w:rPr>
-              <w:t xml:space="preserve">A$1,482.81</w:t>
+              <w:t xml:space="preserve">A$1,782.81</w:t>
             </w:r>
           </w:p>
         </w:tc>
@@ -6426,7 +6760,7 @@
                 <w:sz w:val="21"/>
                 <w:szCs w:val="21"/>
               </w:rPr>
-              <w:t xml:space="preserve">A$1,482.81</w:t>
+              <w:t xml:space="preserve">A$1,782.81</w:t>
             </w:r>
           </w:p>
         </w:tc>
@@ -6617,7 +6951,7 @@
                 <w:sz w:val="21"/>
                 <w:szCs w:val="21"/>
               </w:rPr>
-              <w:t xml:space="preserve">A$1,482.81</w:t>
+              <w:t xml:space="preserve">A$1,782.81</w:t>
             </w:r>
           </w:p>
         </w:tc>
@@ -6808,7 +7142,7 @@
                 <w:sz w:val="21"/>
                 <w:szCs w:val="21"/>
               </w:rPr>
-              <w:t xml:space="preserve">A$1,482.81</w:t>
+              <w:t xml:space="preserve">A$1,782.81</w:t>
             </w:r>
           </w:p>
         </w:tc>
@@ -6999,7 +7333,7 @@
                 <w:sz w:val="21"/>
                 <w:szCs w:val="21"/>
               </w:rPr>
-              <w:t xml:space="preserve">A$1,482.81</w:t>
+              <w:t xml:space="preserve">A$1,782.81</w:t>
             </w:r>
           </w:p>
         </w:tc>
@@ -7190,7 +7524,7 @@
                 <w:sz w:val="21"/>
                 <w:szCs w:val="21"/>
               </w:rPr>
-              <w:t xml:space="preserve">A$1,482.81</w:t>
+              <w:t xml:space="preserve">A$1,782.81</w:t>
             </w:r>
           </w:p>
         </w:tc>
@@ -7381,7 +7715,7 @@
                 <w:sz w:val="21"/>
                 <w:szCs w:val="21"/>
               </w:rPr>
-              <w:t xml:space="preserve">A$1,482.81</w:t>
+              <w:t xml:space="preserve">A$1,782.81</w:t>
             </w:r>
           </w:p>
         </w:tc>
@@ -7572,7 +7906,7 @@
                 <w:sz w:val="21"/>
                 <w:szCs w:val="21"/>
               </w:rPr>
-              <w:t xml:space="preserve">A$1,482.81</w:t>
+              <w:t xml:space="preserve">A$1,782.81</w:t>
             </w:r>
           </w:p>
         </w:tc>
@@ -7763,7 +8097,7 @@
                 <w:sz w:val="21"/>
                 <w:szCs w:val="21"/>
               </w:rPr>
-              <w:t xml:space="preserve">A$1,482.81</w:t>
+              <w:t xml:space="preserve">A$1,782.81</w:t>
             </w:r>
           </w:p>
         </w:tc>
@@ -7954,7 +8288,7 @@
                 <w:sz w:val="21"/>
                 <w:szCs w:val="21"/>
               </w:rPr>
-              <w:t xml:space="preserve">A$1,482.81</w:t>
+              <w:t xml:space="preserve">A$1,782.81</w:t>
             </w:r>
           </w:p>
         </w:tc>
@@ -8145,7 +8479,7 @@
                 <w:sz w:val="21"/>
                 <w:szCs w:val="21"/>
               </w:rPr>
-              <w:t xml:space="preserve">A$1,482.92</w:t>
+              <w:t xml:space="preserve">A$1,782.92</w:t>
             </w:r>
           </w:p>
         </w:tc>
@@ -8271,7 +8605,7 @@
           <w:sz w:val="18"/>
           <w:szCs w:val="18"/>
         </w:rPr>
-        <w:t xml:space="preserve">Note: the A$500.00 holding deposit and the down payment are credited toward the Purchase Price; installments are calculated at 12% p.a. on the reducing balance, with the final installment absorbing rounding. Fill in the due dates from the agreed start date. Each payment takes effect as a record only when confirmed by the Seller’s signature or written receipt. 注:订金500.00澳元与首付款均抵扣总价款;分期款按年利率12%余额递减计算,末期含尾差;请按约定起始日填写各期应付日期;每期还款经卖方签字或出具书面收据确认后方构成有效记录。</w:t>
+        <w:t xml:space="preserve">Note: each monthly "amount due" includes the A$300.00 insurance-and-rego charge under Section 3.8 (finance portion A$1,482.81, final month A$1,482.92); the "balance remaining" column shows the finance principal only. The A$500.00 holding deposit and the down payment are credited toward the Purchase Price; installments are calculated at 12% p.a. on the reducing balance, with the final installment absorbing rounding. Fill in the due dates from the agreed start date. Each payment takes effect as a record only when confirmed by the Seller’s signature or written receipt. 注:各期"应付金额"已含第3.8条保险及注册费月摊300.00澳元(分期部分为1,482.81澳元,末期1,482.92澳元);"剩余余款"列仅为分期本金余额。订金500.00澳元与首付款均抵扣总价款;分期款按年利率12%余额递减计算,末期含尾差;请按约定起始日填写各期应付日期;每期还款经卖方签字或出具书面收据确认后方构成有效记录。</w:t>
       </w:r>
     </w:p>
     <w:sectPr>

</xml_diff>